<commit_message>
Update document titles and prepare Arabic versions
Update metadata to reflect Arabic titles for Word and PDF documents, and include generated Arabic versions of the PRCA-24 assessment.

Replit-Commit-Author: Agent
Replit-Commit-Session-Id: b5f3000a-1a7f-48fa-b96c-272316e9f47f
Replit-Commit-Checkpoint-Type: full_checkpoint
Replit-Commit-Event-Id: 121e66e2-b916-4f39-9c30-42c9844cc799
Replit-Commit-Screenshot-Url: https://storage.googleapis.com/screenshot-production-us-central1/0ddf03ec-4b31-48f4-973d-ddb02c112baa/b5f3000a-1a7f-48fa-b96c-272316e9f47f/1fJ7ENz
Replit-Helium-Checkpoint-Created: true
</commit_message>
<xml_diff>
--- a/PRCA-24_Arabic.docx
+++ b/PRCA-24_Arabic.docx
@@ -5,7 +5,7 @@
     <w:p>
       <w:pPr>
         <w:bidi/>
-        <w:spacing w:before="200" w:after="120"/>
+        <w:spacing w:before="0" w:after="60"/>
         <w:jc w:val="center"/>
         <w:shd w:val="clear" w:color="auto" w:fill="007064"/>
       </w:pPr>
@@ -14,7 +14,7 @@
           <w:rFonts w:ascii="Arial" w:hAnsi="Arial"/>
           <w:b/>
           <w:color w:val="FFFFFF"/>
-          <w:sz w:val="36"/>
+          <w:sz w:val="34"/>
           <w:rtl/>
         </w:rPr>
         <w:t>مقياس التقرير الشخصي لقلق التواصل</w:t>
@@ -23,7 +23,7 @@
     <w:p>
       <w:pPr>
         <w:bidi/>
-        <w:spacing w:before="200" w:after="120"/>
+        <w:spacing w:before="0" w:after="60"/>
         <w:jc w:val="center"/>
         <w:shd w:val="clear" w:color="auto" w:fill="005048"/>
       </w:pPr>
@@ -32,31 +32,16 @@
           <w:rFonts w:ascii="Arial" w:hAnsi="Arial"/>
           <w:b/>
           <w:color w:val="FFFFFF"/>
-          <w:sz w:val="26"/>
+          <w:sz w:val="22"/>
           <w:rtl/>
         </w:rPr>
-        <w:t>Personal Report of Communication Apprehension</w:t>
-      </w:r>
-    </w:p>
-    <w:p>
-      <w:pPr>
-        <w:spacing w:before="80" w:after="40"/>
-        <w:jc w:val="center"/>
-      </w:pPr>
-      <w:r>
-        <w:rPr>
-          <w:rFonts w:ascii="Arial" w:hAnsi="Arial"/>
-          <w:b/>
-          <w:color w:val="007064"/>
-          <w:sz w:val="44"/>
-        </w:rPr>
-        <w:t>PRCA-24</w:t>
+        <w:t>Personal Report of Communication Apprehension  (PRCA-24)</w:t>
       </w:r>
     </w:p>
     <w:p>
       <w:pPr>
         <w:bidi/>
-        <w:spacing w:before="80" w:after="40"/>
+        <w:spacing w:before="100" w:after="20"/>
         <w:jc w:val="center"/>
       </w:pPr>
       <w:r>
@@ -73,7 +58,7 @@
     <w:p>
       <w:pPr>
         <w:bidi/>
-        <w:spacing w:before="0" w:after="320"/>
+        <w:spacing w:before="0" w:after="160"/>
         <w:jc w:val="center"/>
       </w:pPr>
       <w:r>
@@ -81,150 +66,16 @@
           <w:rFonts w:ascii="Arial" w:hAnsi="Arial"/>
           <w:b w:val="0"/>
           <w:color w:val="646464"/>
-          <w:sz w:val="22"/>
+          <w:sz w:val="20"/>
           <w:rtl/>
         </w:rPr>
-        <w:t>قناة اسمع — مملكة الخيزران</w:t>
-      </w:r>
-    </w:p>
-    <w:p/>
-    <w:p>
-      <w:pPr>
-        <w:bidi/>
-        <w:spacing w:before="200" w:after="120"/>
-        <w:jc w:val="center"/>
-        <w:shd w:val="clear" w:color="auto" w:fill="007064"/>
-      </w:pPr>
-      <w:r>
-        <w:rPr>
-          <w:rFonts w:ascii="Arial" w:hAnsi="Arial"/>
-          <w:b/>
-          <w:color w:val="FFFFFF"/>
-          <w:sz w:val="26"/>
-          <w:rtl/>
-        </w:rPr>
-        <w:t>نبذة عن المقياس</w:t>
+        <w:t>قناة اسمع — مملكة الخيزران، الحلقة الثالثة</w:t>
       </w:r>
     </w:p>
     <w:p>
       <w:pPr>
         <w:bidi/>
-        <w:spacing w:before="80" w:after="160"/>
-        <w:jc w:val="right"/>
-      </w:pPr>
-      <w:r>
-        <w:rPr>
-          <w:rFonts w:ascii="Arial" w:hAnsi="Arial"/>
-          <w:b w:val="0"/>
-          <w:sz w:val="24"/>
-          <w:rtl/>
-        </w:rPr>
-        <w:t>مقياس التقرير الشخصي لقلق التواصل (PRCA-24) هو أداة نفسية تقيس درجة القلق الذي يشعر به الفرد عند التواصل مع الآخرين في أربعة سياقات مختلفة: المناقشات الجماعية، والاجتماعات، والمحادثات الشخصية، والخطابة أمام الجمهور. طوّره الباحث James McCroskey، وهو من أكثر مقاييس قلق التواصل استخداماً في البحث العلمي.</w:t>
-      </w:r>
-    </w:p>
-    <w:p>
-      <w:pPr>
-        <w:bidi/>
-        <w:spacing w:before="200" w:after="120"/>
-        <w:jc w:val="center"/>
-        <w:shd w:val="clear" w:color="auto" w:fill="007064"/>
-      </w:pPr>
-      <w:r>
-        <w:rPr>
-          <w:rFonts w:ascii="Arial" w:hAnsi="Arial"/>
-          <w:b/>
-          <w:color w:val="FFFFFF"/>
-          <w:sz w:val="26"/>
-          <w:rtl/>
-        </w:rPr>
-        <w:t>تعليمات الإجابة</w:t>
-      </w:r>
-    </w:p>
-    <w:p>
-      <w:pPr>
-        <w:bidi/>
-        <w:spacing w:before="40" w:after="80"/>
-        <w:jc w:val="right"/>
-      </w:pPr>
-      <w:r>
-        <w:rPr>
-          <w:rFonts w:ascii="Arial" w:hAnsi="Arial"/>
-          <w:b w:val="0"/>
-          <w:sz w:val="24"/>
-          <w:rtl/>
-        </w:rPr>
-        <w:t>1. اقرأ كل عبارة بعناية وأجب بصدق وسرعة — سجّل أول انطباع يتبادر إلى ذهنك.</w:t>
-      </w:r>
-    </w:p>
-    <w:p>
-      <w:pPr>
-        <w:bidi/>
-        <w:spacing w:before="40" w:after="80"/>
-        <w:jc w:val="right"/>
-      </w:pPr>
-      <w:r>
-        <w:rPr>
-          <w:rFonts w:ascii="Arial" w:hAnsi="Arial"/>
-          <w:b w:val="0"/>
-          <w:sz w:val="24"/>
-          <w:rtl/>
-        </w:rPr>
-        <w:t>2. ضع دائرة حول الرقم الذي يعبّر عن مدى انطباق العبارة عليك:</w:t>
-      </w:r>
-    </w:p>
-    <w:p>
-      <w:pPr>
-        <w:bidi/>
-        <w:spacing w:before="40" w:after="80"/>
-        <w:jc w:val="right"/>
-      </w:pPr>
-      <w:r>
-        <w:rPr>
-          <w:rFonts w:ascii="Arial" w:hAnsi="Arial"/>
-          <w:b w:val="0"/>
-          <w:sz w:val="24"/>
-          <w:rtl/>
-        </w:rPr>
-        <w:t xml:space="preserve">     ١ = أوافق بشدة         ٢ = أوافق         ٣ = محايد         ٤ = لا أوافق         ٥ = لا أوافق بشدة</w:t>
-      </w:r>
-    </w:p>
-    <w:p>
-      <w:pPr>
-        <w:bidi/>
-        <w:spacing w:before="40" w:after="80"/>
-        <w:jc w:val="right"/>
-      </w:pPr>
-      <w:r>
-        <w:rPr>
-          <w:rFonts w:ascii="Arial" w:hAnsi="Arial"/>
-          <w:b w:val="0"/>
-          <w:sz w:val="24"/>
-          <w:rtl/>
-        </w:rPr>
-        <w:t>4. لا توجد إجابات صحيحة أو خاطئة — الأهم هو الصدق مع النفس.</w:t>
-      </w:r>
-    </w:p>
-    <w:p>
-      <w:pPr>
-        <w:bidi/>
-        <w:spacing w:before="40" w:after="80"/>
-        <w:jc w:val="right"/>
-      </w:pPr>
-      <w:r>
-        <w:rPr>
-          <w:rFonts w:ascii="Arial" w:hAnsi="Arial"/>
-          <w:b w:val="0"/>
-          <w:sz w:val="24"/>
-          <w:rtl/>
-        </w:rPr>
-        <w:t>5. أجب على جميع العبارات الـ 24 قبل الانتقال إلى صفحة الحساب.</w:t>
-      </w:r>
-    </w:p>
-    <w:p/>
-    <w:p>
-      <w:pPr>
-        <w:bidi/>
-        <w:spacing w:before="200" w:after="120"/>
+        <w:spacing w:before="80" w:after="60"/>
         <w:jc w:val="center"/>
         <w:shd w:val="clear" w:color="auto" w:fill="008C7E"/>
       </w:pPr>
@@ -234,6 +85,57 @@
           <w:b/>
           <w:color w:val="FFFFFF"/>
           <w:sz w:val="24"/>
+          <w:rtl/>
+        </w:rPr>
+        <w:t>التعليمات</w:t>
+      </w:r>
+    </w:p>
+    <w:p>
+      <w:pPr>
+        <w:bidi/>
+        <w:spacing w:before="60" w:after="60"/>
+        <w:jc w:val="right"/>
+      </w:pPr>
+      <w:r>
+        <w:rPr>
+          <w:rFonts w:ascii="Arial" w:hAnsi="Arial"/>
+          <w:b w:val="0"/>
+          <w:sz w:val="22"/>
+          <w:rtl/>
+        </w:rPr>
+        <w:t>يتكون هذا المقياس من 24 عبارة تتعلق بمشاعرك حول التواصل مع الآخرين. يُرجى تحديد درجة انطباق كل عبارة عليك باختيار الرقم المناسب أمام كل عبارة:</w:t>
+      </w:r>
+    </w:p>
+    <w:p>
+      <w:pPr>
+        <w:bidi/>
+        <w:spacing w:before="0" w:after="160"/>
+        <w:jc w:val="center"/>
+      </w:pPr>
+      <w:r>
+        <w:rPr>
+          <w:rFonts w:ascii="Arial" w:hAnsi="Arial"/>
+          <w:b/>
+          <w:color w:val="005048"/>
+          <w:sz w:val="22"/>
+          <w:rtl/>
+        </w:rPr>
+        <w:t>أوافق بشدة = ١     أوافق = ٢     محايد = ٣     لا أوافق = ٤     لا أوافق بشدة = ٥</w:t>
+      </w:r>
+    </w:p>
+    <w:p>
+      <w:pPr>
+        <w:bidi/>
+        <w:spacing w:before="120" w:after="60"/>
+        <w:jc w:val="center"/>
+        <w:shd w:val="clear" w:color="auto" w:fill="008C7E"/>
+      </w:pPr>
+      <w:r>
+        <w:rPr>
+          <w:rFonts w:ascii="Arial" w:hAnsi="Arial"/>
+          <w:b/>
+          <w:color w:val="FFFFFF"/>
+          <w:sz w:val="22"/>
           <w:rtl/>
         </w:rPr>
         <w:t>المناقشات الجماعية</w:t>
@@ -247,22 +149,23 @@
         <w:tblLook w:firstColumn="1" w:firstRow="1" w:lastColumn="0" w:lastRow="0" w:noHBand="0" w:noVBand="1" w:val="04A0"/>
       </w:tblPr>
       <w:tblGrid>
-        <w:gridCol w:w="1512"/>
-        <w:gridCol w:w="1512"/>
-        <w:gridCol w:w="1512"/>
-        <w:gridCol w:w="1512"/>
-        <w:gridCol w:w="1512"/>
-        <w:gridCol w:w="1512"/>
+        <w:gridCol w:w="1569"/>
+        <w:gridCol w:w="1569"/>
+        <w:gridCol w:w="1569"/>
+        <w:gridCol w:w="1569"/>
+        <w:gridCol w:w="1569"/>
+        <w:gridCol w:w="1569"/>
       </w:tblGrid>
       <w:tr>
         <w:tc>
           <w:tcPr>
-            <w:tcW w:type="dxa" w:w="5386"/>
+            <w:tcW w:type="dxa" w:w="5556"/>
             <w:vAlign w:val="center"/>
             <w:shd w:val="clear" w:color="auto" w:fill="007064"/>
           </w:tcPr>
           <w:p>
             <w:pPr>
+              <w:spacing w:before="40" w:after="40"/>
               <w:jc w:val="center"/>
             </w:pPr>
             <w:r>
@@ -270,7 +173,8 @@
                 <w:rFonts w:ascii="Arial" w:hAnsi="Arial"/>
                 <w:b/>
                 <w:color w:val="FFFFFF"/>
-                <w:sz w:val="20"/>
+                <w:sz w:val="18"/>
+                <w:rtl/>
               </w:rPr>
               <w:t>العبارة</w:t>
             </w:r>
@@ -284,6 +188,7 @@
           </w:tcPr>
           <w:p>
             <w:pPr>
+              <w:spacing w:before="40" w:after="40"/>
               <w:jc w:val="center"/>
             </w:pPr>
             <w:r>
@@ -291,7 +196,8 @@
                 <w:rFonts w:ascii="Arial" w:hAnsi="Arial"/>
                 <w:b/>
                 <w:color w:val="FFFFFF"/>
-                <w:sz w:val="20"/>
+                <w:sz w:val="18"/>
+                <w:rtl/>
               </w:rPr>
               <w:t>أوافق بشدة</w:t>
               <w:br/>
@@ -307,6 +213,7 @@
           </w:tcPr>
           <w:p>
             <w:pPr>
+              <w:spacing w:before="40" w:after="40"/>
               <w:jc w:val="center"/>
             </w:pPr>
             <w:r>
@@ -314,7 +221,8 @@
                 <w:rFonts w:ascii="Arial" w:hAnsi="Arial"/>
                 <w:b/>
                 <w:color w:val="FFFFFF"/>
-                <w:sz w:val="20"/>
+                <w:sz w:val="18"/>
+                <w:rtl/>
               </w:rPr>
               <w:t>أوافق</w:t>
               <w:br/>
@@ -330,6 +238,7 @@
           </w:tcPr>
           <w:p>
             <w:pPr>
+              <w:spacing w:before="40" w:after="40"/>
               <w:jc w:val="center"/>
             </w:pPr>
             <w:r>
@@ -337,7 +246,8 @@
                 <w:rFonts w:ascii="Arial" w:hAnsi="Arial"/>
                 <w:b/>
                 <w:color w:val="FFFFFF"/>
-                <w:sz w:val="20"/>
+                <w:sz w:val="18"/>
+                <w:rtl/>
               </w:rPr>
               <w:t>محايد</w:t>
               <w:br/>
@@ -353,6 +263,7 @@
           </w:tcPr>
           <w:p>
             <w:pPr>
+              <w:spacing w:before="40" w:after="40"/>
               <w:jc w:val="center"/>
             </w:pPr>
             <w:r>
@@ -360,7 +271,8 @@
                 <w:rFonts w:ascii="Arial" w:hAnsi="Arial"/>
                 <w:b/>
                 <w:color w:val="FFFFFF"/>
-                <w:sz w:val="20"/>
+                <w:sz w:val="18"/>
+                <w:rtl/>
               </w:rPr>
               <w:t>لا أوافق</w:t>
               <w:br/>
@@ -370,12 +282,13 @@
         </w:tc>
         <w:tc>
           <w:tcPr>
-            <w:tcW w:type="dxa" w:w="1417"/>
+            <w:tcW w:type="dxa" w:w="1247"/>
             <w:vAlign w:val="center"/>
             <w:shd w:val="clear" w:color="auto" w:fill="007064"/>
           </w:tcPr>
           <w:p>
             <w:pPr>
+              <w:spacing w:before="40" w:after="40"/>
               <w:jc w:val="center"/>
             </w:pPr>
             <w:r>
@@ -383,7 +296,8 @@
                 <w:rFonts w:ascii="Arial" w:hAnsi="Arial"/>
                 <w:b/>
                 <w:color w:val="FFFFFF"/>
-                <w:sz w:val="20"/>
+                <w:sz w:val="18"/>
+                <w:rtl/>
               </w:rPr>
               <w:t>لا أوافق بشدة</w:t>
               <w:br/>
@@ -395,7 +309,7 @@
       <w:tr>
         <w:tc>
           <w:tcPr>
-            <w:tcW w:type="dxa" w:w="5386"/>
+            <w:tcW w:type="dxa" w:w="5556"/>
             <w:vAlign w:val="center"/>
           </w:tcPr>
           <w:p>
@@ -407,7 +321,7 @@
             <w:r>
               <w:rPr>
                 <w:rFonts w:ascii="Arial" w:hAnsi="Arial"/>
-                <w:sz w:val="22"/>
+                <w:sz w:val="21"/>
                 <w:rtl/>
               </w:rPr>
               <w:t>1. لا أحب المشاركة في المناقشات الجماعية.</w:t>
@@ -421,6 +335,7 @@
           </w:tcPr>
           <w:p>
             <w:pPr>
+              <w:spacing w:before="40" w:after="40"/>
               <w:jc w:val="center"/>
             </w:pPr>
             <w:r>
@@ -439,6 +354,7 @@
           </w:tcPr>
           <w:p>
             <w:pPr>
+              <w:spacing w:before="40" w:after="40"/>
               <w:jc w:val="center"/>
             </w:pPr>
             <w:r>
@@ -457,6 +373,7 @@
           </w:tcPr>
           <w:p>
             <w:pPr>
+              <w:spacing w:before="40" w:after="40"/>
               <w:jc w:val="center"/>
             </w:pPr>
             <w:r>
@@ -475,6 +392,7 @@
           </w:tcPr>
           <w:p>
             <w:pPr>
+              <w:spacing w:before="40" w:after="40"/>
               <w:jc w:val="center"/>
             </w:pPr>
             <w:r>
@@ -488,11 +406,12 @@
         </w:tc>
         <w:tc>
           <w:tcPr>
-            <w:tcW w:type="dxa" w:w="1417"/>
+            <w:tcW w:type="dxa" w:w="1247"/>
             <w:vAlign w:val="center"/>
           </w:tcPr>
           <w:p>
             <w:pPr>
+              <w:spacing w:before="40" w:after="40"/>
               <w:jc w:val="center"/>
             </w:pPr>
             <w:r>
@@ -508,7 +427,7 @@
       <w:tr>
         <w:tc>
           <w:tcPr>
-            <w:tcW w:type="dxa" w:w="5386"/>
+            <w:tcW w:type="dxa" w:w="5556"/>
             <w:vAlign w:val="center"/>
             <w:shd w:val="clear" w:color="auto" w:fill="E8F5F3"/>
           </w:tcPr>
@@ -521,7 +440,7 @@
             <w:r>
               <w:rPr>
                 <w:rFonts w:ascii="Arial" w:hAnsi="Arial"/>
-                <w:sz w:val="22"/>
+                <w:sz w:val="21"/>
                 <w:rtl/>
               </w:rPr>
               <w:t>2. بشكل عام، أشعر بالراحة عند المشاركة في المناقشات الجماعية.</w:t>
@@ -536,6 +455,7 @@
           </w:tcPr>
           <w:p>
             <w:pPr>
+              <w:spacing w:before="40" w:after="40"/>
               <w:jc w:val="center"/>
             </w:pPr>
             <w:r>
@@ -555,6 +475,7 @@
           </w:tcPr>
           <w:p>
             <w:pPr>
+              <w:spacing w:before="40" w:after="40"/>
               <w:jc w:val="center"/>
             </w:pPr>
             <w:r>
@@ -574,6 +495,7 @@
           </w:tcPr>
           <w:p>
             <w:pPr>
+              <w:spacing w:before="40" w:after="40"/>
               <w:jc w:val="center"/>
             </w:pPr>
             <w:r>
@@ -593,6 +515,7 @@
           </w:tcPr>
           <w:p>
             <w:pPr>
+              <w:spacing w:before="40" w:after="40"/>
               <w:jc w:val="center"/>
             </w:pPr>
             <w:r>
@@ -606,12 +529,13 @@
         </w:tc>
         <w:tc>
           <w:tcPr>
-            <w:tcW w:type="dxa" w:w="1417"/>
+            <w:tcW w:type="dxa" w:w="1247"/>
             <w:vAlign w:val="center"/>
             <w:shd w:val="clear" w:color="auto" w:fill="E8F5F3"/>
           </w:tcPr>
           <w:p>
             <w:pPr>
+              <w:spacing w:before="40" w:after="40"/>
               <w:jc w:val="center"/>
             </w:pPr>
             <w:r>
@@ -627,7 +551,7 @@
       <w:tr>
         <w:tc>
           <w:tcPr>
-            <w:tcW w:type="dxa" w:w="5386"/>
+            <w:tcW w:type="dxa" w:w="5556"/>
             <w:vAlign w:val="center"/>
           </w:tcPr>
           <w:p>
@@ -639,7 +563,7 @@
             <w:r>
               <w:rPr>
                 <w:rFonts w:ascii="Arial" w:hAnsi="Arial"/>
-                <w:sz w:val="22"/>
+                <w:sz w:val="21"/>
                 <w:rtl/>
               </w:rPr>
               <w:t>3. أشعر بالتوتر والقلق عند المشاركة في المناقشات الجماعية.</w:t>
@@ -653,6 +577,7 @@
           </w:tcPr>
           <w:p>
             <w:pPr>
+              <w:spacing w:before="40" w:after="40"/>
               <w:jc w:val="center"/>
             </w:pPr>
             <w:r>
@@ -671,6 +596,7 @@
           </w:tcPr>
           <w:p>
             <w:pPr>
+              <w:spacing w:before="40" w:after="40"/>
               <w:jc w:val="center"/>
             </w:pPr>
             <w:r>
@@ -689,6 +615,7 @@
           </w:tcPr>
           <w:p>
             <w:pPr>
+              <w:spacing w:before="40" w:after="40"/>
               <w:jc w:val="center"/>
             </w:pPr>
             <w:r>
@@ -707,6 +634,7 @@
           </w:tcPr>
           <w:p>
             <w:pPr>
+              <w:spacing w:before="40" w:after="40"/>
               <w:jc w:val="center"/>
             </w:pPr>
             <w:r>
@@ -720,11 +648,12 @@
         </w:tc>
         <w:tc>
           <w:tcPr>
-            <w:tcW w:type="dxa" w:w="1417"/>
+            <w:tcW w:type="dxa" w:w="1247"/>
             <w:vAlign w:val="center"/>
           </w:tcPr>
           <w:p>
             <w:pPr>
+              <w:spacing w:before="40" w:after="40"/>
               <w:jc w:val="center"/>
             </w:pPr>
             <w:r>
@@ -740,7 +669,7 @@
       <w:tr>
         <w:tc>
           <w:tcPr>
-            <w:tcW w:type="dxa" w:w="5386"/>
+            <w:tcW w:type="dxa" w:w="5556"/>
             <w:vAlign w:val="center"/>
             <w:shd w:val="clear" w:color="auto" w:fill="E8F5F3"/>
           </w:tcPr>
@@ -753,7 +682,7 @@
             <w:r>
               <w:rPr>
                 <w:rFonts w:ascii="Arial" w:hAnsi="Arial"/>
-                <w:sz w:val="22"/>
+                <w:sz w:val="21"/>
                 <w:rtl/>
               </w:rPr>
               <w:t>4. أحب الانخراط في المناقشات الجماعية.</w:t>
@@ -768,6 +697,7 @@
           </w:tcPr>
           <w:p>
             <w:pPr>
+              <w:spacing w:before="40" w:after="40"/>
               <w:jc w:val="center"/>
             </w:pPr>
             <w:r>
@@ -787,6 +717,7 @@
           </w:tcPr>
           <w:p>
             <w:pPr>
+              <w:spacing w:before="40" w:after="40"/>
               <w:jc w:val="center"/>
             </w:pPr>
             <w:r>
@@ -806,6 +737,7 @@
           </w:tcPr>
           <w:p>
             <w:pPr>
+              <w:spacing w:before="40" w:after="40"/>
               <w:jc w:val="center"/>
             </w:pPr>
             <w:r>
@@ -825,6 +757,7 @@
           </w:tcPr>
           <w:p>
             <w:pPr>
+              <w:spacing w:before="40" w:after="40"/>
               <w:jc w:val="center"/>
             </w:pPr>
             <w:r>
@@ -838,12 +771,13 @@
         </w:tc>
         <w:tc>
           <w:tcPr>
-            <w:tcW w:type="dxa" w:w="1417"/>
+            <w:tcW w:type="dxa" w:w="1247"/>
             <w:vAlign w:val="center"/>
             <w:shd w:val="clear" w:color="auto" w:fill="E8F5F3"/>
           </w:tcPr>
           <w:p>
             <w:pPr>
+              <w:spacing w:before="40" w:after="40"/>
               <w:jc w:val="center"/>
             </w:pPr>
             <w:r>
@@ -859,7 +793,7 @@
       <w:tr>
         <w:tc>
           <w:tcPr>
-            <w:tcW w:type="dxa" w:w="5386"/>
+            <w:tcW w:type="dxa" w:w="5556"/>
             <w:vAlign w:val="center"/>
           </w:tcPr>
           <w:p>
@@ -871,7 +805,7 @@
             <w:r>
               <w:rPr>
                 <w:rFonts w:ascii="Arial" w:hAnsi="Arial"/>
-                <w:sz w:val="22"/>
+                <w:sz w:val="21"/>
                 <w:rtl/>
               </w:rPr>
               <w:t>5. الانخراط في نقاش جماعي مع أشخاص جدد يجعلني متوتراً وقلقاً.</w:t>
@@ -885,6 +819,7 @@
           </w:tcPr>
           <w:p>
             <w:pPr>
+              <w:spacing w:before="40" w:after="40"/>
               <w:jc w:val="center"/>
             </w:pPr>
             <w:r>
@@ -903,6 +838,7 @@
           </w:tcPr>
           <w:p>
             <w:pPr>
+              <w:spacing w:before="40" w:after="40"/>
               <w:jc w:val="center"/>
             </w:pPr>
             <w:r>
@@ -921,6 +857,7 @@
           </w:tcPr>
           <w:p>
             <w:pPr>
+              <w:spacing w:before="40" w:after="40"/>
               <w:jc w:val="center"/>
             </w:pPr>
             <w:r>
@@ -939,6 +876,7 @@
           </w:tcPr>
           <w:p>
             <w:pPr>
+              <w:spacing w:before="40" w:after="40"/>
               <w:jc w:val="center"/>
             </w:pPr>
             <w:r>
@@ -952,11 +890,12 @@
         </w:tc>
         <w:tc>
           <w:tcPr>
-            <w:tcW w:type="dxa" w:w="1417"/>
+            <w:tcW w:type="dxa" w:w="1247"/>
             <w:vAlign w:val="center"/>
           </w:tcPr>
           <w:p>
             <w:pPr>
+              <w:spacing w:before="40" w:after="40"/>
               <w:jc w:val="center"/>
             </w:pPr>
             <w:r>
@@ -972,7 +911,7 @@
       <w:tr>
         <w:tc>
           <w:tcPr>
-            <w:tcW w:type="dxa" w:w="5386"/>
+            <w:tcW w:type="dxa" w:w="5556"/>
             <w:vAlign w:val="center"/>
             <w:shd w:val="clear" w:color="auto" w:fill="E8F5F3"/>
           </w:tcPr>
@@ -985,7 +924,7 @@
             <w:r>
               <w:rPr>
                 <w:rFonts w:ascii="Arial" w:hAnsi="Arial"/>
-                <w:sz w:val="22"/>
+                <w:sz w:val="21"/>
                 <w:rtl/>
               </w:rPr>
               <w:t>6. أشعر بالهدوء والارتياح عند المشاركة في المناقشات الجماعية.</w:t>
@@ -1000,6 +939,7 @@
           </w:tcPr>
           <w:p>
             <w:pPr>
+              <w:spacing w:before="40" w:after="40"/>
               <w:jc w:val="center"/>
             </w:pPr>
             <w:r>
@@ -1019,6 +959,7 @@
           </w:tcPr>
           <w:p>
             <w:pPr>
+              <w:spacing w:before="40" w:after="40"/>
               <w:jc w:val="center"/>
             </w:pPr>
             <w:r>
@@ -1038,6 +979,7 @@
           </w:tcPr>
           <w:p>
             <w:pPr>
+              <w:spacing w:before="40" w:after="40"/>
               <w:jc w:val="center"/>
             </w:pPr>
             <w:r>
@@ -1057,6 +999,7 @@
           </w:tcPr>
           <w:p>
             <w:pPr>
+              <w:spacing w:before="40" w:after="40"/>
               <w:jc w:val="center"/>
             </w:pPr>
             <w:r>
@@ -1070,12 +1013,13 @@
         </w:tc>
         <w:tc>
           <w:tcPr>
-            <w:tcW w:type="dxa" w:w="1417"/>
+            <w:tcW w:type="dxa" w:w="1247"/>
             <w:vAlign w:val="center"/>
             <w:shd w:val="clear" w:color="auto" w:fill="E8F5F3"/>
           </w:tcPr>
           <w:p>
             <w:pPr>
+              <w:spacing w:before="40" w:after="40"/>
               <w:jc w:val="center"/>
             </w:pPr>
             <w:r>
@@ -1089,11 +1033,10 @@
         </w:tc>
       </w:tr>
     </w:tbl>
-    <w:p/>
     <w:p>
       <w:pPr>
         <w:bidi/>
-        <w:spacing w:before="200" w:after="120"/>
+        <w:spacing w:before="120" w:after="60"/>
         <w:jc w:val="center"/>
         <w:shd w:val="clear" w:color="auto" w:fill="008C7E"/>
       </w:pPr>
@@ -1102,7 +1045,7 @@
           <w:rFonts w:ascii="Arial" w:hAnsi="Arial"/>
           <w:b/>
           <w:color w:val="FFFFFF"/>
-          <w:sz w:val="24"/>
+          <w:sz w:val="22"/>
           <w:rtl/>
         </w:rPr>
         <w:t>الاجتماعات</w:t>
@@ -1116,22 +1059,23 @@
         <w:tblLook w:firstColumn="1" w:firstRow="1" w:lastColumn="0" w:lastRow="0" w:noHBand="0" w:noVBand="1" w:val="04A0"/>
       </w:tblPr>
       <w:tblGrid>
-        <w:gridCol w:w="1512"/>
-        <w:gridCol w:w="1512"/>
-        <w:gridCol w:w="1512"/>
-        <w:gridCol w:w="1512"/>
-        <w:gridCol w:w="1512"/>
-        <w:gridCol w:w="1512"/>
+        <w:gridCol w:w="1569"/>
+        <w:gridCol w:w="1569"/>
+        <w:gridCol w:w="1569"/>
+        <w:gridCol w:w="1569"/>
+        <w:gridCol w:w="1569"/>
+        <w:gridCol w:w="1569"/>
       </w:tblGrid>
       <w:tr>
         <w:tc>
           <w:tcPr>
-            <w:tcW w:type="dxa" w:w="5386"/>
+            <w:tcW w:type="dxa" w:w="5556"/>
             <w:vAlign w:val="center"/>
             <w:shd w:val="clear" w:color="auto" w:fill="007064"/>
           </w:tcPr>
           <w:p>
             <w:pPr>
+              <w:spacing w:before="40" w:after="40"/>
               <w:jc w:val="center"/>
             </w:pPr>
             <w:r>
@@ -1139,7 +1083,8 @@
                 <w:rFonts w:ascii="Arial" w:hAnsi="Arial"/>
                 <w:b/>
                 <w:color w:val="FFFFFF"/>
-                <w:sz w:val="20"/>
+                <w:sz w:val="18"/>
+                <w:rtl/>
               </w:rPr>
               <w:t>العبارة</w:t>
             </w:r>
@@ -1153,6 +1098,7 @@
           </w:tcPr>
           <w:p>
             <w:pPr>
+              <w:spacing w:before="40" w:after="40"/>
               <w:jc w:val="center"/>
             </w:pPr>
             <w:r>
@@ -1160,7 +1106,8 @@
                 <w:rFonts w:ascii="Arial" w:hAnsi="Arial"/>
                 <w:b/>
                 <w:color w:val="FFFFFF"/>
-                <w:sz w:val="20"/>
+                <w:sz w:val="18"/>
+                <w:rtl/>
               </w:rPr>
               <w:t>أوافق بشدة</w:t>
               <w:br/>
@@ -1176,6 +1123,7 @@
           </w:tcPr>
           <w:p>
             <w:pPr>
+              <w:spacing w:before="40" w:after="40"/>
               <w:jc w:val="center"/>
             </w:pPr>
             <w:r>
@@ -1183,7 +1131,8 @@
                 <w:rFonts w:ascii="Arial" w:hAnsi="Arial"/>
                 <w:b/>
                 <w:color w:val="FFFFFF"/>
-                <w:sz w:val="20"/>
+                <w:sz w:val="18"/>
+                <w:rtl/>
               </w:rPr>
               <w:t>أوافق</w:t>
               <w:br/>
@@ -1199,6 +1148,7 @@
           </w:tcPr>
           <w:p>
             <w:pPr>
+              <w:spacing w:before="40" w:after="40"/>
               <w:jc w:val="center"/>
             </w:pPr>
             <w:r>
@@ -1206,7 +1156,8 @@
                 <w:rFonts w:ascii="Arial" w:hAnsi="Arial"/>
                 <w:b/>
                 <w:color w:val="FFFFFF"/>
-                <w:sz w:val="20"/>
+                <w:sz w:val="18"/>
+                <w:rtl/>
               </w:rPr>
               <w:t>محايد</w:t>
               <w:br/>
@@ -1222,6 +1173,7 @@
           </w:tcPr>
           <w:p>
             <w:pPr>
+              <w:spacing w:before="40" w:after="40"/>
               <w:jc w:val="center"/>
             </w:pPr>
             <w:r>
@@ -1229,7 +1181,8 @@
                 <w:rFonts w:ascii="Arial" w:hAnsi="Arial"/>
                 <w:b/>
                 <w:color w:val="FFFFFF"/>
-                <w:sz w:val="20"/>
+                <w:sz w:val="18"/>
+                <w:rtl/>
               </w:rPr>
               <w:t>لا أوافق</w:t>
               <w:br/>
@@ -1239,12 +1192,13 @@
         </w:tc>
         <w:tc>
           <w:tcPr>
-            <w:tcW w:type="dxa" w:w="1417"/>
+            <w:tcW w:type="dxa" w:w="1247"/>
             <w:vAlign w:val="center"/>
             <w:shd w:val="clear" w:color="auto" w:fill="007064"/>
           </w:tcPr>
           <w:p>
             <w:pPr>
+              <w:spacing w:before="40" w:after="40"/>
               <w:jc w:val="center"/>
             </w:pPr>
             <w:r>
@@ -1252,7 +1206,8 @@
                 <w:rFonts w:ascii="Arial" w:hAnsi="Arial"/>
                 <w:b/>
                 <w:color w:val="FFFFFF"/>
-                <w:sz w:val="20"/>
+                <w:sz w:val="18"/>
+                <w:rtl/>
               </w:rPr>
               <w:t>لا أوافق بشدة</w:t>
               <w:br/>
@@ -1264,7 +1219,7 @@
       <w:tr>
         <w:tc>
           <w:tcPr>
-            <w:tcW w:type="dxa" w:w="5386"/>
+            <w:tcW w:type="dxa" w:w="5556"/>
             <w:vAlign w:val="center"/>
           </w:tcPr>
           <w:p>
@@ -1276,7 +1231,7 @@
             <w:r>
               <w:rPr>
                 <w:rFonts w:ascii="Arial" w:hAnsi="Arial"/>
-                <w:sz w:val="22"/>
+                <w:sz w:val="21"/>
                 <w:rtl/>
               </w:rPr>
               <w:t>7. بشكل عام، أشعر بالتوتر عندما يتعين علي المشاركة في اجتماع.</w:t>
@@ -1290,6 +1245,7 @@
           </w:tcPr>
           <w:p>
             <w:pPr>
+              <w:spacing w:before="40" w:after="40"/>
               <w:jc w:val="center"/>
             </w:pPr>
             <w:r>
@@ -1308,6 +1264,7 @@
           </w:tcPr>
           <w:p>
             <w:pPr>
+              <w:spacing w:before="40" w:after="40"/>
               <w:jc w:val="center"/>
             </w:pPr>
             <w:r>
@@ -1326,6 +1283,7 @@
           </w:tcPr>
           <w:p>
             <w:pPr>
+              <w:spacing w:before="40" w:after="40"/>
               <w:jc w:val="center"/>
             </w:pPr>
             <w:r>
@@ -1344,6 +1302,7 @@
           </w:tcPr>
           <w:p>
             <w:pPr>
+              <w:spacing w:before="40" w:after="40"/>
               <w:jc w:val="center"/>
             </w:pPr>
             <w:r>
@@ -1357,11 +1316,12 @@
         </w:tc>
         <w:tc>
           <w:tcPr>
-            <w:tcW w:type="dxa" w:w="1417"/>
+            <w:tcW w:type="dxa" w:w="1247"/>
             <w:vAlign w:val="center"/>
           </w:tcPr>
           <w:p>
             <w:pPr>
+              <w:spacing w:before="40" w:after="40"/>
               <w:jc w:val="center"/>
             </w:pPr>
             <w:r>
@@ -1377,7 +1337,7 @@
       <w:tr>
         <w:tc>
           <w:tcPr>
-            <w:tcW w:type="dxa" w:w="5386"/>
+            <w:tcW w:type="dxa" w:w="5556"/>
             <w:vAlign w:val="center"/>
             <w:shd w:val="clear" w:color="auto" w:fill="E8F5F3"/>
           </w:tcPr>
@@ -1390,7 +1350,7 @@
             <w:r>
               <w:rPr>
                 <w:rFonts w:ascii="Arial" w:hAnsi="Arial"/>
-                <w:sz w:val="22"/>
+                <w:sz w:val="21"/>
                 <w:rtl/>
               </w:rPr>
               <w:t>8. عادةً ما أشعر بالهدوء والارتياح أثناء المشاركة في الاجتماعات.</w:t>
@@ -1405,6 +1365,7 @@
           </w:tcPr>
           <w:p>
             <w:pPr>
+              <w:spacing w:before="40" w:after="40"/>
               <w:jc w:val="center"/>
             </w:pPr>
             <w:r>
@@ -1424,6 +1385,7 @@
           </w:tcPr>
           <w:p>
             <w:pPr>
+              <w:spacing w:before="40" w:after="40"/>
               <w:jc w:val="center"/>
             </w:pPr>
             <w:r>
@@ -1443,6 +1405,7 @@
           </w:tcPr>
           <w:p>
             <w:pPr>
+              <w:spacing w:before="40" w:after="40"/>
               <w:jc w:val="center"/>
             </w:pPr>
             <w:r>
@@ -1462,6 +1425,7 @@
           </w:tcPr>
           <w:p>
             <w:pPr>
+              <w:spacing w:before="40" w:after="40"/>
               <w:jc w:val="center"/>
             </w:pPr>
             <w:r>
@@ -1475,12 +1439,13 @@
         </w:tc>
         <w:tc>
           <w:tcPr>
-            <w:tcW w:type="dxa" w:w="1417"/>
+            <w:tcW w:type="dxa" w:w="1247"/>
             <w:vAlign w:val="center"/>
             <w:shd w:val="clear" w:color="auto" w:fill="E8F5F3"/>
           </w:tcPr>
           <w:p>
             <w:pPr>
+              <w:spacing w:before="40" w:after="40"/>
               <w:jc w:val="center"/>
             </w:pPr>
             <w:r>
@@ -1496,7 +1461,7 @@
       <w:tr>
         <w:tc>
           <w:tcPr>
-            <w:tcW w:type="dxa" w:w="5386"/>
+            <w:tcW w:type="dxa" w:w="5556"/>
             <w:vAlign w:val="center"/>
           </w:tcPr>
           <w:p>
@@ -1508,7 +1473,7 @@
             <w:r>
               <w:rPr>
                 <w:rFonts w:ascii="Arial" w:hAnsi="Arial"/>
-                <w:sz w:val="22"/>
+                <w:sz w:val="21"/>
                 <w:rtl/>
               </w:rPr>
               <w:t>9. أشعر بهدوء تام عند الطلب مني إبداء رأيي في اجتماع.</w:t>
@@ -1522,6 +1487,7 @@
           </w:tcPr>
           <w:p>
             <w:pPr>
+              <w:spacing w:before="40" w:after="40"/>
               <w:jc w:val="center"/>
             </w:pPr>
             <w:r>
@@ -1540,6 +1506,7 @@
           </w:tcPr>
           <w:p>
             <w:pPr>
+              <w:spacing w:before="40" w:after="40"/>
               <w:jc w:val="center"/>
             </w:pPr>
             <w:r>
@@ -1558,6 +1525,7 @@
           </w:tcPr>
           <w:p>
             <w:pPr>
+              <w:spacing w:before="40" w:after="40"/>
               <w:jc w:val="center"/>
             </w:pPr>
             <w:r>
@@ -1576,6 +1544,7 @@
           </w:tcPr>
           <w:p>
             <w:pPr>
+              <w:spacing w:before="40" w:after="40"/>
               <w:jc w:val="center"/>
             </w:pPr>
             <w:r>
@@ -1589,11 +1558,12 @@
         </w:tc>
         <w:tc>
           <w:tcPr>
-            <w:tcW w:type="dxa" w:w="1417"/>
+            <w:tcW w:type="dxa" w:w="1247"/>
             <w:vAlign w:val="center"/>
           </w:tcPr>
           <w:p>
             <w:pPr>
+              <w:spacing w:before="40" w:after="40"/>
               <w:jc w:val="center"/>
             </w:pPr>
             <w:r>
@@ -1609,7 +1579,7 @@
       <w:tr>
         <w:tc>
           <w:tcPr>
-            <w:tcW w:type="dxa" w:w="5386"/>
+            <w:tcW w:type="dxa" w:w="5556"/>
             <w:vAlign w:val="center"/>
             <w:shd w:val="clear" w:color="auto" w:fill="E8F5F3"/>
           </w:tcPr>
@@ -1622,7 +1592,7 @@
             <w:r>
               <w:rPr>
                 <w:rFonts w:ascii="Arial" w:hAnsi="Arial"/>
-                <w:sz w:val="22"/>
+                <w:sz w:val="21"/>
                 <w:rtl/>
               </w:rPr>
               <w:t>10. أخشى التعبير عن رأيي في الاجتماعات.</w:t>
@@ -1637,6 +1607,7 @@
           </w:tcPr>
           <w:p>
             <w:pPr>
+              <w:spacing w:before="40" w:after="40"/>
               <w:jc w:val="center"/>
             </w:pPr>
             <w:r>
@@ -1656,6 +1627,7 @@
           </w:tcPr>
           <w:p>
             <w:pPr>
+              <w:spacing w:before="40" w:after="40"/>
               <w:jc w:val="center"/>
             </w:pPr>
             <w:r>
@@ -1675,6 +1647,7 @@
           </w:tcPr>
           <w:p>
             <w:pPr>
+              <w:spacing w:before="40" w:after="40"/>
               <w:jc w:val="center"/>
             </w:pPr>
             <w:r>
@@ -1694,6 +1667,7 @@
           </w:tcPr>
           <w:p>
             <w:pPr>
+              <w:spacing w:before="40" w:after="40"/>
               <w:jc w:val="center"/>
             </w:pPr>
             <w:r>
@@ -1707,12 +1681,13 @@
         </w:tc>
         <w:tc>
           <w:tcPr>
-            <w:tcW w:type="dxa" w:w="1417"/>
+            <w:tcW w:type="dxa" w:w="1247"/>
             <w:vAlign w:val="center"/>
             <w:shd w:val="clear" w:color="auto" w:fill="E8F5F3"/>
           </w:tcPr>
           <w:p>
             <w:pPr>
+              <w:spacing w:before="40" w:after="40"/>
               <w:jc w:val="center"/>
             </w:pPr>
             <w:r>
@@ -1728,7 +1703,7 @@
       <w:tr>
         <w:tc>
           <w:tcPr>
-            <w:tcW w:type="dxa" w:w="5386"/>
+            <w:tcW w:type="dxa" w:w="5556"/>
             <w:vAlign w:val="center"/>
           </w:tcPr>
           <w:p>
@@ -1740,7 +1715,7 @@
             <w:r>
               <w:rPr>
                 <w:rFonts w:ascii="Arial" w:hAnsi="Arial"/>
-                <w:sz w:val="22"/>
+                <w:sz w:val="21"/>
                 <w:rtl/>
               </w:rPr>
               <w:t>11. التواصل في الاجتماعات يجعلني أشعر بعدم الارتياح عادةً.</w:t>
@@ -1754,6 +1729,7 @@
           </w:tcPr>
           <w:p>
             <w:pPr>
+              <w:spacing w:before="40" w:after="40"/>
               <w:jc w:val="center"/>
             </w:pPr>
             <w:r>
@@ -1772,6 +1748,7 @@
           </w:tcPr>
           <w:p>
             <w:pPr>
+              <w:spacing w:before="40" w:after="40"/>
               <w:jc w:val="center"/>
             </w:pPr>
             <w:r>
@@ -1790,6 +1767,7 @@
           </w:tcPr>
           <w:p>
             <w:pPr>
+              <w:spacing w:before="40" w:after="40"/>
               <w:jc w:val="center"/>
             </w:pPr>
             <w:r>
@@ -1808,6 +1786,7 @@
           </w:tcPr>
           <w:p>
             <w:pPr>
+              <w:spacing w:before="40" w:after="40"/>
               <w:jc w:val="center"/>
             </w:pPr>
             <w:r>
@@ -1821,11 +1800,12 @@
         </w:tc>
         <w:tc>
           <w:tcPr>
-            <w:tcW w:type="dxa" w:w="1417"/>
+            <w:tcW w:type="dxa" w:w="1247"/>
             <w:vAlign w:val="center"/>
           </w:tcPr>
           <w:p>
             <w:pPr>
+              <w:spacing w:before="40" w:after="40"/>
               <w:jc w:val="center"/>
             </w:pPr>
             <w:r>
@@ -1841,7 +1821,7 @@
       <w:tr>
         <w:tc>
           <w:tcPr>
-            <w:tcW w:type="dxa" w:w="5386"/>
+            <w:tcW w:type="dxa" w:w="5556"/>
             <w:vAlign w:val="center"/>
             <w:shd w:val="clear" w:color="auto" w:fill="E8F5F3"/>
           </w:tcPr>
@@ -1854,7 +1834,7 @@
             <w:r>
               <w:rPr>
                 <w:rFonts w:ascii="Arial" w:hAnsi="Arial"/>
-                <w:sz w:val="22"/>
+                <w:sz w:val="21"/>
                 <w:rtl/>
               </w:rPr>
               <w:t>12. أشعر بارتياح تام عند الإجابة على الأسئلة في الاجتماعات.</w:t>
@@ -1869,6 +1849,7 @@
           </w:tcPr>
           <w:p>
             <w:pPr>
+              <w:spacing w:before="40" w:after="40"/>
               <w:jc w:val="center"/>
             </w:pPr>
             <w:r>
@@ -1888,6 +1869,7 @@
           </w:tcPr>
           <w:p>
             <w:pPr>
+              <w:spacing w:before="40" w:after="40"/>
               <w:jc w:val="center"/>
             </w:pPr>
             <w:r>
@@ -1907,6 +1889,7 @@
           </w:tcPr>
           <w:p>
             <w:pPr>
+              <w:spacing w:before="40" w:after="40"/>
               <w:jc w:val="center"/>
             </w:pPr>
             <w:r>
@@ -1926,6 +1909,7 @@
           </w:tcPr>
           <w:p>
             <w:pPr>
+              <w:spacing w:before="40" w:after="40"/>
               <w:jc w:val="center"/>
             </w:pPr>
             <w:r>
@@ -1939,12 +1923,13 @@
         </w:tc>
         <w:tc>
           <w:tcPr>
-            <w:tcW w:type="dxa" w:w="1417"/>
+            <w:tcW w:type="dxa" w:w="1247"/>
             <w:vAlign w:val="center"/>
             <w:shd w:val="clear" w:color="auto" w:fill="E8F5F3"/>
           </w:tcPr>
           <w:p>
             <w:pPr>
+              <w:spacing w:before="40" w:after="40"/>
               <w:jc w:val="center"/>
             </w:pPr>
             <w:r>
@@ -1958,11 +1943,10 @@
         </w:tc>
       </w:tr>
     </w:tbl>
-    <w:p/>
     <w:p>
       <w:pPr>
         <w:bidi/>
-        <w:spacing w:before="200" w:after="120"/>
+        <w:spacing w:before="120" w:after="60"/>
         <w:jc w:val="center"/>
         <w:shd w:val="clear" w:color="auto" w:fill="008C7E"/>
       </w:pPr>
@@ -1971,7 +1955,7 @@
           <w:rFonts w:ascii="Arial" w:hAnsi="Arial"/>
           <w:b/>
           <w:color w:val="FFFFFF"/>
-          <w:sz w:val="24"/>
+          <w:sz w:val="22"/>
           <w:rtl/>
         </w:rPr>
         <w:t>المحادثات الشخصية</w:t>
@@ -1985,22 +1969,23 @@
         <w:tblLook w:firstColumn="1" w:firstRow="1" w:lastColumn="0" w:lastRow="0" w:noHBand="0" w:noVBand="1" w:val="04A0"/>
       </w:tblPr>
       <w:tblGrid>
-        <w:gridCol w:w="1512"/>
-        <w:gridCol w:w="1512"/>
-        <w:gridCol w:w="1512"/>
-        <w:gridCol w:w="1512"/>
-        <w:gridCol w:w="1512"/>
-        <w:gridCol w:w="1512"/>
+        <w:gridCol w:w="1569"/>
+        <w:gridCol w:w="1569"/>
+        <w:gridCol w:w="1569"/>
+        <w:gridCol w:w="1569"/>
+        <w:gridCol w:w="1569"/>
+        <w:gridCol w:w="1569"/>
       </w:tblGrid>
       <w:tr>
         <w:tc>
           <w:tcPr>
-            <w:tcW w:type="dxa" w:w="5386"/>
+            <w:tcW w:type="dxa" w:w="5556"/>
             <w:vAlign w:val="center"/>
             <w:shd w:val="clear" w:color="auto" w:fill="007064"/>
           </w:tcPr>
           <w:p>
             <w:pPr>
+              <w:spacing w:before="40" w:after="40"/>
               <w:jc w:val="center"/>
             </w:pPr>
             <w:r>
@@ -2008,7 +1993,8 @@
                 <w:rFonts w:ascii="Arial" w:hAnsi="Arial"/>
                 <w:b/>
                 <w:color w:val="FFFFFF"/>
-                <w:sz w:val="20"/>
+                <w:sz w:val="18"/>
+                <w:rtl/>
               </w:rPr>
               <w:t>العبارة</w:t>
             </w:r>
@@ -2022,6 +2008,7 @@
           </w:tcPr>
           <w:p>
             <w:pPr>
+              <w:spacing w:before="40" w:after="40"/>
               <w:jc w:val="center"/>
             </w:pPr>
             <w:r>
@@ -2029,7 +2016,8 @@
                 <w:rFonts w:ascii="Arial" w:hAnsi="Arial"/>
                 <w:b/>
                 <w:color w:val="FFFFFF"/>
-                <w:sz w:val="20"/>
+                <w:sz w:val="18"/>
+                <w:rtl/>
               </w:rPr>
               <w:t>أوافق بشدة</w:t>
               <w:br/>
@@ -2045,6 +2033,7 @@
           </w:tcPr>
           <w:p>
             <w:pPr>
+              <w:spacing w:before="40" w:after="40"/>
               <w:jc w:val="center"/>
             </w:pPr>
             <w:r>
@@ -2052,7 +2041,8 @@
                 <w:rFonts w:ascii="Arial" w:hAnsi="Arial"/>
                 <w:b/>
                 <w:color w:val="FFFFFF"/>
-                <w:sz w:val="20"/>
+                <w:sz w:val="18"/>
+                <w:rtl/>
               </w:rPr>
               <w:t>أوافق</w:t>
               <w:br/>
@@ -2068,6 +2058,7 @@
           </w:tcPr>
           <w:p>
             <w:pPr>
+              <w:spacing w:before="40" w:after="40"/>
               <w:jc w:val="center"/>
             </w:pPr>
             <w:r>
@@ -2075,7 +2066,8 @@
                 <w:rFonts w:ascii="Arial" w:hAnsi="Arial"/>
                 <w:b/>
                 <w:color w:val="FFFFFF"/>
-                <w:sz w:val="20"/>
+                <w:sz w:val="18"/>
+                <w:rtl/>
               </w:rPr>
               <w:t>محايد</w:t>
               <w:br/>
@@ -2091,6 +2083,7 @@
           </w:tcPr>
           <w:p>
             <w:pPr>
+              <w:spacing w:before="40" w:after="40"/>
               <w:jc w:val="center"/>
             </w:pPr>
             <w:r>
@@ -2098,7 +2091,8 @@
                 <w:rFonts w:ascii="Arial" w:hAnsi="Arial"/>
                 <w:b/>
                 <w:color w:val="FFFFFF"/>
-                <w:sz w:val="20"/>
+                <w:sz w:val="18"/>
+                <w:rtl/>
               </w:rPr>
               <w:t>لا أوافق</w:t>
               <w:br/>
@@ -2108,12 +2102,13 @@
         </w:tc>
         <w:tc>
           <w:tcPr>
-            <w:tcW w:type="dxa" w:w="1417"/>
+            <w:tcW w:type="dxa" w:w="1247"/>
             <w:vAlign w:val="center"/>
             <w:shd w:val="clear" w:color="auto" w:fill="007064"/>
           </w:tcPr>
           <w:p>
             <w:pPr>
+              <w:spacing w:before="40" w:after="40"/>
               <w:jc w:val="center"/>
             </w:pPr>
             <w:r>
@@ -2121,7 +2116,8 @@
                 <w:rFonts w:ascii="Arial" w:hAnsi="Arial"/>
                 <w:b/>
                 <w:color w:val="FFFFFF"/>
-                <w:sz w:val="20"/>
+                <w:sz w:val="18"/>
+                <w:rtl/>
               </w:rPr>
               <w:t>لا أوافق بشدة</w:t>
               <w:br/>
@@ -2133,7 +2129,7 @@
       <w:tr>
         <w:tc>
           <w:tcPr>
-            <w:tcW w:type="dxa" w:w="5386"/>
+            <w:tcW w:type="dxa" w:w="5556"/>
             <w:vAlign w:val="center"/>
           </w:tcPr>
           <w:p>
@@ -2145,7 +2141,7 @@
             <w:r>
               <w:rPr>
                 <w:rFonts w:ascii="Arial" w:hAnsi="Arial"/>
-                <w:sz w:val="22"/>
+                <w:sz w:val="21"/>
                 <w:rtl/>
               </w:rPr>
               <w:t>13. عند التحدث مع شخص جديد، أشعر بتوتر شديد.</w:t>
@@ -2159,6 +2155,7 @@
           </w:tcPr>
           <w:p>
             <w:pPr>
+              <w:spacing w:before="40" w:after="40"/>
               <w:jc w:val="center"/>
             </w:pPr>
             <w:r>
@@ -2177,6 +2174,7 @@
           </w:tcPr>
           <w:p>
             <w:pPr>
+              <w:spacing w:before="40" w:after="40"/>
               <w:jc w:val="center"/>
             </w:pPr>
             <w:r>
@@ -2195,6 +2193,7 @@
           </w:tcPr>
           <w:p>
             <w:pPr>
+              <w:spacing w:before="40" w:after="40"/>
               <w:jc w:val="center"/>
             </w:pPr>
             <w:r>
@@ -2213,6 +2212,7 @@
           </w:tcPr>
           <w:p>
             <w:pPr>
+              <w:spacing w:before="40" w:after="40"/>
               <w:jc w:val="center"/>
             </w:pPr>
             <w:r>
@@ -2226,11 +2226,12 @@
         </w:tc>
         <w:tc>
           <w:tcPr>
-            <w:tcW w:type="dxa" w:w="1417"/>
+            <w:tcW w:type="dxa" w:w="1247"/>
             <w:vAlign w:val="center"/>
           </w:tcPr>
           <w:p>
             <w:pPr>
+              <w:spacing w:before="40" w:after="40"/>
               <w:jc w:val="center"/>
             </w:pPr>
             <w:r>
@@ -2246,7 +2247,7 @@
       <w:tr>
         <w:tc>
           <w:tcPr>
-            <w:tcW w:type="dxa" w:w="5386"/>
+            <w:tcW w:type="dxa" w:w="5556"/>
             <w:vAlign w:val="center"/>
             <w:shd w:val="clear" w:color="auto" w:fill="E8F5F3"/>
           </w:tcPr>
@@ -2259,7 +2260,7 @@
             <w:r>
               <w:rPr>
                 <w:rFonts w:ascii="Arial" w:hAnsi="Arial"/>
-                <w:sz w:val="22"/>
+                <w:sz w:val="21"/>
                 <w:rtl/>
               </w:rPr>
               <w:t>14. لا أخشى التعبير عن رأيي في المحادثات.</w:t>
@@ -2274,6 +2275,7 @@
           </w:tcPr>
           <w:p>
             <w:pPr>
+              <w:spacing w:before="40" w:after="40"/>
               <w:jc w:val="center"/>
             </w:pPr>
             <w:r>
@@ -2293,6 +2295,7 @@
           </w:tcPr>
           <w:p>
             <w:pPr>
+              <w:spacing w:before="40" w:after="40"/>
               <w:jc w:val="center"/>
             </w:pPr>
             <w:r>
@@ -2312,6 +2315,7 @@
           </w:tcPr>
           <w:p>
             <w:pPr>
+              <w:spacing w:before="40" w:after="40"/>
               <w:jc w:val="center"/>
             </w:pPr>
             <w:r>
@@ -2331,6 +2335,7 @@
           </w:tcPr>
           <w:p>
             <w:pPr>
+              <w:spacing w:before="40" w:after="40"/>
               <w:jc w:val="center"/>
             </w:pPr>
             <w:r>
@@ -2344,12 +2349,13 @@
         </w:tc>
         <w:tc>
           <w:tcPr>
-            <w:tcW w:type="dxa" w:w="1417"/>
+            <w:tcW w:type="dxa" w:w="1247"/>
             <w:vAlign w:val="center"/>
             <w:shd w:val="clear" w:color="auto" w:fill="E8F5F3"/>
           </w:tcPr>
           <w:p>
             <w:pPr>
+              <w:spacing w:before="40" w:after="40"/>
               <w:jc w:val="center"/>
             </w:pPr>
             <w:r>
@@ -2365,7 +2371,7 @@
       <w:tr>
         <w:tc>
           <w:tcPr>
-            <w:tcW w:type="dxa" w:w="5386"/>
+            <w:tcW w:type="dxa" w:w="5556"/>
             <w:vAlign w:val="center"/>
           </w:tcPr>
           <w:p>
@@ -2377,7 +2383,7 @@
             <w:r>
               <w:rPr>
                 <w:rFonts w:ascii="Arial" w:hAnsi="Arial"/>
-                <w:sz w:val="22"/>
+                <w:sz w:val="21"/>
                 <w:rtl/>
               </w:rPr>
               <w:t>15. في العادة، أشعر بتوتر شديد في المحادثات.</w:t>
@@ -2391,6 +2397,7 @@
           </w:tcPr>
           <w:p>
             <w:pPr>
+              <w:spacing w:before="40" w:after="40"/>
               <w:jc w:val="center"/>
             </w:pPr>
             <w:r>
@@ -2409,6 +2416,7 @@
           </w:tcPr>
           <w:p>
             <w:pPr>
+              <w:spacing w:before="40" w:after="40"/>
               <w:jc w:val="center"/>
             </w:pPr>
             <w:r>
@@ -2427,6 +2435,7 @@
           </w:tcPr>
           <w:p>
             <w:pPr>
+              <w:spacing w:before="40" w:after="40"/>
               <w:jc w:val="center"/>
             </w:pPr>
             <w:r>
@@ -2445,6 +2454,7 @@
           </w:tcPr>
           <w:p>
             <w:pPr>
+              <w:spacing w:before="40" w:after="40"/>
               <w:jc w:val="center"/>
             </w:pPr>
             <w:r>
@@ -2458,11 +2468,12 @@
         </w:tc>
         <w:tc>
           <w:tcPr>
-            <w:tcW w:type="dxa" w:w="1417"/>
+            <w:tcW w:type="dxa" w:w="1247"/>
             <w:vAlign w:val="center"/>
           </w:tcPr>
           <w:p>
             <w:pPr>
+              <w:spacing w:before="40" w:after="40"/>
               <w:jc w:val="center"/>
             </w:pPr>
             <w:r>
@@ -2478,7 +2489,7 @@
       <w:tr>
         <w:tc>
           <w:tcPr>
-            <w:tcW w:type="dxa" w:w="5386"/>
+            <w:tcW w:type="dxa" w:w="5556"/>
             <w:vAlign w:val="center"/>
             <w:shd w:val="clear" w:color="auto" w:fill="E8F5F3"/>
           </w:tcPr>
@@ -2491,7 +2502,7 @@
             <w:r>
               <w:rPr>
                 <w:rFonts w:ascii="Arial" w:hAnsi="Arial"/>
-                <w:sz w:val="22"/>
+                <w:sz w:val="21"/>
                 <w:rtl/>
               </w:rPr>
               <w:t>16. في العادة، أشعر بهدوء وارتياح تام في المحادثات.</w:t>
@@ -2506,6 +2517,7 @@
           </w:tcPr>
           <w:p>
             <w:pPr>
+              <w:spacing w:before="40" w:after="40"/>
               <w:jc w:val="center"/>
             </w:pPr>
             <w:r>
@@ -2525,6 +2537,7 @@
           </w:tcPr>
           <w:p>
             <w:pPr>
+              <w:spacing w:before="40" w:after="40"/>
               <w:jc w:val="center"/>
             </w:pPr>
             <w:r>
@@ -2544,6 +2557,7 @@
           </w:tcPr>
           <w:p>
             <w:pPr>
+              <w:spacing w:before="40" w:after="40"/>
               <w:jc w:val="center"/>
             </w:pPr>
             <w:r>
@@ -2563,6 +2577,7 @@
           </w:tcPr>
           <w:p>
             <w:pPr>
+              <w:spacing w:before="40" w:after="40"/>
               <w:jc w:val="center"/>
             </w:pPr>
             <w:r>
@@ -2576,12 +2591,13 @@
         </w:tc>
         <w:tc>
           <w:tcPr>
-            <w:tcW w:type="dxa" w:w="1417"/>
+            <w:tcW w:type="dxa" w:w="1247"/>
             <w:vAlign w:val="center"/>
             <w:shd w:val="clear" w:color="auto" w:fill="E8F5F3"/>
           </w:tcPr>
           <w:p>
             <w:pPr>
+              <w:spacing w:before="40" w:after="40"/>
               <w:jc w:val="center"/>
             </w:pPr>
             <w:r>
@@ -2597,7 +2613,7 @@
       <w:tr>
         <w:tc>
           <w:tcPr>
-            <w:tcW w:type="dxa" w:w="5386"/>
+            <w:tcW w:type="dxa" w:w="5556"/>
             <w:vAlign w:val="center"/>
           </w:tcPr>
           <w:p>
@@ -2609,7 +2625,7 @@
             <w:r>
               <w:rPr>
                 <w:rFonts w:ascii="Arial" w:hAnsi="Arial"/>
-                <w:sz w:val="22"/>
+                <w:sz w:val="21"/>
                 <w:rtl/>
               </w:rPr>
               <w:t>17. عند التحدث مع شخص جديد، أشعر بارتياح كبير وعدم قلق.</w:t>
@@ -2623,6 +2639,7 @@
           </w:tcPr>
           <w:p>
             <w:pPr>
+              <w:spacing w:before="40" w:after="40"/>
               <w:jc w:val="center"/>
             </w:pPr>
             <w:r>
@@ -2641,6 +2658,7 @@
           </w:tcPr>
           <w:p>
             <w:pPr>
+              <w:spacing w:before="40" w:after="40"/>
               <w:jc w:val="center"/>
             </w:pPr>
             <w:r>
@@ -2659,6 +2677,7 @@
           </w:tcPr>
           <w:p>
             <w:pPr>
+              <w:spacing w:before="40" w:after="40"/>
               <w:jc w:val="center"/>
             </w:pPr>
             <w:r>
@@ -2677,6 +2696,7 @@
           </w:tcPr>
           <w:p>
             <w:pPr>
+              <w:spacing w:before="40" w:after="40"/>
               <w:jc w:val="center"/>
             </w:pPr>
             <w:r>
@@ -2690,11 +2710,12 @@
         </w:tc>
         <w:tc>
           <w:tcPr>
-            <w:tcW w:type="dxa" w:w="1417"/>
+            <w:tcW w:type="dxa" w:w="1247"/>
             <w:vAlign w:val="center"/>
           </w:tcPr>
           <w:p>
             <w:pPr>
+              <w:spacing w:before="40" w:after="40"/>
               <w:jc w:val="center"/>
             </w:pPr>
             <w:r>
@@ -2710,7 +2731,7 @@
       <w:tr>
         <w:tc>
           <w:tcPr>
-            <w:tcW w:type="dxa" w:w="5386"/>
+            <w:tcW w:type="dxa" w:w="5556"/>
             <w:vAlign w:val="center"/>
             <w:shd w:val="clear" w:color="auto" w:fill="E8F5F3"/>
           </w:tcPr>
@@ -2723,7 +2744,7 @@
             <w:r>
               <w:rPr>
                 <w:rFonts w:ascii="Arial" w:hAnsi="Arial"/>
-                <w:sz w:val="22"/>
+                <w:sz w:val="21"/>
                 <w:rtl/>
               </w:rPr>
               <w:t>18. أخشى التحدث في المحادثات.</w:t>
@@ -2738,6 +2759,7 @@
           </w:tcPr>
           <w:p>
             <w:pPr>
+              <w:spacing w:before="40" w:after="40"/>
               <w:jc w:val="center"/>
             </w:pPr>
             <w:r>
@@ -2757,6 +2779,7 @@
           </w:tcPr>
           <w:p>
             <w:pPr>
+              <w:spacing w:before="40" w:after="40"/>
               <w:jc w:val="center"/>
             </w:pPr>
             <w:r>
@@ -2776,6 +2799,7 @@
           </w:tcPr>
           <w:p>
             <w:pPr>
+              <w:spacing w:before="40" w:after="40"/>
               <w:jc w:val="center"/>
             </w:pPr>
             <w:r>
@@ -2795,6 +2819,7 @@
           </w:tcPr>
           <w:p>
             <w:pPr>
+              <w:spacing w:before="40" w:after="40"/>
               <w:jc w:val="center"/>
             </w:pPr>
             <w:r>
@@ -2808,12 +2833,13 @@
         </w:tc>
         <w:tc>
           <w:tcPr>
-            <w:tcW w:type="dxa" w:w="1417"/>
+            <w:tcW w:type="dxa" w:w="1247"/>
             <w:vAlign w:val="center"/>
             <w:shd w:val="clear" w:color="auto" w:fill="E8F5F3"/>
           </w:tcPr>
           <w:p>
             <w:pPr>
+              <w:spacing w:before="40" w:after="40"/>
               <w:jc w:val="center"/>
             </w:pPr>
             <w:r>
@@ -2827,11 +2853,10 @@
         </w:tc>
       </w:tr>
     </w:tbl>
-    <w:p/>
     <w:p>
       <w:pPr>
         <w:bidi/>
-        <w:spacing w:before="200" w:after="120"/>
+        <w:spacing w:before="120" w:after="60"/>
         <w:jc w:val="center"/>
         <w:shd w:val="clear" w:color="auto" w:fill="008C7E"/>
       </w:pPr>
@@ -2840,7 +2865,7 @@
           <w:rFonts w:ascii="Arial" w:hAnsi="Arial"/>
           <w:b/>
           <w:color w:val="FFFFFF"/>
-          <w:sz w:val="24"/>
+          <w:sz w:val="22"/>
           <w:rtl/>
         </w:rPr>
         <w:t>الخطابة والتحدث أمام الجمهور</w:t>
@@ -2854,22 +2879,23 @@
         <w:tblLook w:firstColumn="1" w:firstRow="1" w:lastColumn="0" w:lastRow="0" w:noHBand="0" w:noVBand="1" w:val="04A0"/>
       </w:tblPr>
       <w:tblGrid>
-        <w:gridCol w:w="1512"/>
-        <w:gridCol w:w="1512"/>
-        <w:gridCol w:w="1512"/>
-        <w:gridCol w:w="1512"/>
-        <w:gridCol w:w="1512"/>
-        <w:gridCol w:w="1512"/>
+        <w:gridCol w:w="1569"/>
+        <w:gridCol w:w="1569"/>
+        <w:gridCol w:w="1569"/>
+        <w:gridCol w:w="1569"/>
+        <w:gridCol w:w="1569"/>
+        <w:gridCol w:w="1569"/>
       </w:tblGrid>
       <w:tr>
         <w:tc>
           <w:tcPr>
-            <w:tcW w:type="dxa" w:w="5386"/>
+            <w:tcW w:type="dxa" w:w="5556"/>
             <w:vAlign w:val="center"/>
             <w:shd w:val="clear" w:color="auto" w:fill="007064"/>
           </w:tcPr>
           <w:p>
             <w:pPr>
+              <w:spacing w:before="40" w:after="40"/>
               <w:jc w:val="center"/>
             </w:pPr>
             <w:r>
@@ -2877,7 +2903,8 @@
                 <w:rFonts w:ascii="Arial" w:hAnsi="Arial"/>
                 <w:b/>
                 <w:color w:val="FFFFFF"/>
-                <w:sz w:val="20"/>
+                <w:sz w:val="18"/>
+                <w:rtl/>
               </w:rPr>
               <w:t>العبارة</w:t>
             </w:r>
@@ -2891,6 +2918,7 @@
           </w:tcPr>
           <w:p>
             <w:pPr>
+              <w:spacing w:before="40" w:after="40"/>
               <w:jc w:val="center"/>
             </w:pPr>
             <w:r>
@@ -2898,7 +2926,8 @@
                 <w:rFonts w:ascii="Arial" w:hAnsi="Arial"/>
                 <w:b/>
                 <w:color w:val="FFFFFF"/>
-                <w:sz w:val="20"/>
+                <w:sz w:val="18"/>
+                <w:rtl/>
               </w:rPr>
               <w:t>أوافق بشدة</w:t>
               <w:br/>
@@ -2914,6 +2943,7 @@
           </w:tcPr>
           <w:p>
             <w:pPr>
+              <w:spacing w:before="40" w:after="40"/>
               <w:jc w:val="center"/>
             </w:pPr>
             <w:r>
@@ -2921,7 +2951,8 @@
                 <w:rFonts w:ascii="Arial" w:hAnsi="Arial"/>
                 <w:b/>
                 <w:color w:val="FFFFFF"/>
-                <w:sz w:val="20"/>
+                <w:sz w:val="18"/>
+                <w:rtl/>
               </w:rPr>
               <w:t>أوافق</w:t>
               <w:br/>
@@ -2937,6 +2968,7 @@
           </w:tcPr>
           <w:p>
             <w:pPr>
+              <w:spacing w:before="40" w:after="40"/>
               <w:jc w:val="center"/>
             </w:pPr>
             <w:r>
@@ -2944,7 +2976,8 @@
                 <w:rFonts w:ascii="Arial" w:hAnsi="Arial"/>
                 <w:b/>
                 <w:color w:val="FFFFFF"/>
-                <w:sz w:val="20"/>
+                <w:sz w:val="18"/>
+                <w:rtl/>
               </w:rPr>
               <w:t>محايد</w:t>
               <w:br/>
@@ -2960,6 +2993,7 @@
           </w:tcPr>
           <w:p>
             <w:pPr>
+              <w:spacing w:before="40" w:after="40"/>
               <w:jc w:val="center"/>
             </w:pPr>
             <w:r>
@@ -2967,7 +3001,8 @@
                 <w:rFonts w:ascii="Arial" w:hAnsi="Arial"/>
                 <w:b/>
                 <w:color w:val="FFFFFF"/>
-                <w:sz w:val="20"/>
+                <w:sz w:val="18"/>
+                <w:rtl/>
               </w:rPr>
               <w:t>لا أوافق</w:t>
               <w:br/>
@@ -2977,12 +3012,13 @@
         </w:tc>
         <w:tc>
           <w:tcPr>
-            <w:tcW w:type="dxa" w:w="1417"/>
+            <w:tcW w:type="dxa" w:w="1247"/>
             <w:vAlign w:val="center"/>
             <w:shd w:val="clear" w:color="auto" w:fill="007064"/>
           </w:tcPr>
           <w:p>
             <w:pPr>
+              <w:spacing w:before="40" w:after="40"/>
               <w:jc w:val="center"/>
             </w:pPr>
             <w:r>
@@ -2990,7 +3026,8 @@
                 <w:rFonts w:ascii="Arial" w:hAnsi="Arial"/>
                 <w:b/>
                 <w:color w:val="FFFFFF"/>
-                <w:sz w:val="20"/>
+                <w:sz w:val="18"/>
+                <w:rtl/>
               </w:rPr>
               <w:t>لا أوافق بشدة</w:t>
               <w:br/>
@@ -3002,7 +3039,7 @@
       <w:tr>
         <w:tc>
           <w:tcPr>
-            <w:tcW w:type="dxa" w:w="5386"/>
+            <w:tcW w:type="dxa" w:w="5556"/>
             <w:vAlign w:val="center"/>
           </w:tcPr>
           <w:p>
@@ -3014,7 +3051,7 @@
             <w:r>
               <w:rPr>
                 <w:rFonts w:ascii="Arial" w:hAnsi="Arial"/>
-                <w:sz w:val="22"/>
+                <w:sz w:val="21"/>
                 <w:rtl/>
               </w:rPr>
               <w:t>19. لا أخشى إلقاء خطاب.</w:t>
@@ -3028,6 +3065,7 @@
           </w:tcPr>
           <w:p>
             <w:pPr>
+              <w:spacing w:before="40" w:after="40"/>
               <w:jc w:val="center"/>
             </w:pPr>
             <w:r>
@@ -3046,6 +3084,7 @@
           </w:tcPr>
           <w:p>
             <w:pPr>
+              <w:spacing w:before="40" w:after="40"/>
               <w:jc w:val="center"/>
             </w:pPr>
             <w:r>
@@ -3064,6 +3103,7 @@
           </w:tcPr>
           <w:p>
             <w:pPr>
+              <w:spacing w:before="40" w:after="40"/>
               <w:jc w:val="center"/>
             </w:pPr>
             <w:r>
@@ -3082,6 +3122,7 @@
           </w:tcPr>
           <w:p>
             <w:pPr>
+              <w:spacing w:before="40" w:after="40"/>
               <w:jc w:val="center"/>
             </w:pPr>
             <w:r>
@@ -3095,11 +3136,12 @@
         </w:tc>
         <w:tc>
           <w:tcPr>
-            <w:tcW w:type="dxa" w:w="1417"/>
+            <w:tcW w:type="dxa" w:w="1247"/>
             <w:vAlign w:val="center"/>
           </w:tcPr>
           <w:p>
             <w:pPr>
+              <w:spacing w:before="40" w:after="40"/>
               <w:jc w:val="center"/>
             </w:pPr>
             <w:r>
@@ -3115,7 +3157,7 @@
       <w:tr>
         <w:tc>
           <w:tcPr>
-            <w:tcW w:type="dxa" w:w="5386"/>
+            <w:tcW w:type="dxa" w:w="5556"/>
             <w:vAlign w:val="center"/>
             <w:shd w:val="clear" w:color="auto" w:fill="E8F5F3"/>
           </w:tcPr>
@@ -3128,7 +3170,7 @@
             <w:r>
               <w:rPr>
                 <w:rFonts w:ascii="Arial" w:hAnsi="Arial"/>
-                <w:sz w:val="22"/>
+                <w:sz w:val="21"/>
                 <w:rtl/>
               </w:rPr>
               <w:t>20. تشعر أجزاء من جسدي بالتوتر والتصلب أثناء إلقاء الخطاب.</w:t>
@@ -3143,6 +3185,7 @@
           </w:tcPr>
           <w:p>
             <w:pPr>
+              <w:spacing w:before="40" w:after="40"/>
               <w:jc w:val="center"/>
             </w:pPr>
             <w:r>
@@ -3162,6 +3205,7 @@
           </w:tcPr>
           <w:p>
             <w:pPr>
+              <w:spacing w:before="40" w:after="40"/>
               <w:jc w:val="center"/>
             </w:pPr>
             <w:r>
@@ -3181,6 +3225,7 @@
           </w:tcPr>
           <w:p>
             <w:pPr>
+              <w:spacing w:before="40" w:after="40"/>
               <w:jc w:val="center"/>
             </w:pPr>
             <w:r>
@@ -3200,6 +3245,7 @@
           </w:tcPr>
           <w:p>
             <w:pPr>
+              <w:spacing w:before="40" w:after="40"/>
               <w:jc w:val="center"/>
             </w:pPr>
             <w:r>
@@ -3213,12 +3259,13 @@
         </w:tc>
         <w:tc>
           <w:tcPr>
-            <w:tcW w:type="dxa" w:w="1417"/>
+            <w:tcW w:type="dxa" w:w="1247"/>
             <w:vAlign w:val="center"/>
             <w:shd w:val="clear" w:color="auto" w:fill="E8F5F3"/>
           </w:tcPr>
           <w:p>
             <w:pPr>
+              <w:spacing w:before="40" w:after="40"/>
               <w:jc w:val="center"/>
             </w:pPr>
             <w:r>
@@ -3234,7 +3281,7 @@
       <w:tr>
         <w:tc>
           <w:tcPr>
-            <w:tcW w:type="dxa" w:w="5386"/>
+            <w:tcW w:type="dxa" w:w="5556"/>
             <w:vAlign w:val="center"/>
           </w:tcPr>
           <w:p>
@@ -3246,7 +3293,7 @@
             <w:r>
               <w:rPr>
                 <w:rFonts w:ascii="Arial" w:hAnsi="Arial"/>
-                <w:sz w:val="22"/>
+                <w:sz w:val="21"/>
                 <w:rtl/>
               </w:rPr>
               <w:t>21. أشعر بالارتياح وعدم القلق عند إلقاء الخطاب.</w:t>
@@ -3260,6 +3307,7 @@
           </w:tcPr>
           <w:p>
             <w:pPr>
+              <w:spacing w:before="40" w:after="40"/>
               <w:jc w:val="center"/>
             </w:pPr>
             <w:r>
@@ -3278,6 +3326,7 @@
           </w:tcPr>
           <w:p>
             <w:pPr>
+              <w:spacing w:before="40" w:after="40"/>
               <w:jc w:val="center"/>
             </w:pPr>
             <w:r>
@@ -3296,6 +3345,7 @@
           </w:tcPr>
           <w:p>
             <w:pPr>
+              <w:spacing w:before="40" w:after="40"/>
               <w:jc w:val="center"/>
             </w:pPr>
             <w:r>
@@ -3314,6 +3364,7 @@
           </w:tcPr>
           <w:p>
             <w:pPr>
+              <w:spacing w:before="40" w:after="40"/>
               <w:jc w:val="center"/>
             </w:pPr>
             <w:r>
@@ -3327,11 +3378,12 @@
         </w:tc>
         <w:tc>
           <w:tcPr>
-            <w:tcW w:type="dxa" w:w="1417"/>
+            <w:tcW w:type="dxa" w:w="1247"/>
             <w:vAlign w:val="center"/>
           </w:tcPr>
           <w:p>
             <w:pPr>
+              <w:spacing w:before="40" w:after="40"/>
               <w:jc w:val="center"/>
             </w:pPr>
             <w:r>
@@ -3347,7 +3399,7 @@
       <w:tr>
         <w:tc>
           <w:tcPr>
-            <w:tcW w:type="dxa" w:w="5386"/>
+            <w:tcW w:type="dxa" w:w="5556"/>
             <w:vAlign w:val="center"/>
             <w:shd w:val="clear" w:color="auto" w:fill="E8F5F3"/>
           </w:tcPr>
@@ -3360,7 +3412,7 @@
             <w:r>
               <w:rPr>
                 <w:rFonts w:ascii="Arial" w:hAnsi="Arial"/>
-                <w:sz w:val="22"/>
+                <w:sz w:val="21"/>
                 <w:rtl/>
               </w:rPr>
               <w:t>22. تصبح أفكاري مشوشة ومضطربة أثناء إلقاء الخطاب.</w:t>
@@ -3375,6 +3427,7 @@
           </w:tcPr>
           <w:p>
             <w:pPr>
+              <w:spacing w:before="40" w:after="40"/>
               <w:jc w:val="center"/>
             </w:pPr>
             <w:r>
@@ -3394,6 +3447,7 @@
           </w:tcPr>
           <w:p>
             <w:pPr>
+              <w:spacing w:before="40" w:after="40"/>
               <w:jc w:val="center"/>
             </w:pPr>
             <w:r>
@@ -3413,6 +3467,7 @@
           </w:tcPr>
           <w:p>
             <w:pPr>
+              <w:spacing w:before="40" w:after="40"/>
               <w:jc w:val="center"/>
             </w:pPr>
             <w:r>
@@ -3432,6 +3487,7 @@
           </w:tcPr>
           <w:p>
             <w:pPr>
+              <w:spacing w:before="40" w:after="40"/>
               <w:jc w:val="center"/>
             </w:pPr>
             <w:r>
@@ -3445,12 +3501,13 @@
         </w:tc>
         <w:tc>
           <w:tcPr>
-            <w:tcW w:type="dxa" w:w="1417"/>
+            <w:tcW w:type="dxa" w:w="1247"/>
             <w:vAlign w:val="center"/>
             <w:shd w:val="clear" w:color="auto" w:fill="E8F5F3"/>
           </w:tcPr>
           <w:p>
             <w:pPr>
+              <w:spacing w:before="40" w:after="40"/>
               <w:jc w:val="center"/>
             </w:pPr>
             <w:r>
@@ -3466,7 +3523,7 @@
       <w:tr>
         <w:tc>
           <w:tcPr>
-            <w:tcW w:type="dxa" w:w="5386"/>
+            <w:tcW w:type="dxa" w:w="5556"/>
             <w:vAlign w:val="center"/>
           </w:tcPr>
           <w:p>
@@ -3478,7 +3535,7 @@
             <w:r>
               <w:rPr>
                 <w:rFonts w:ascii="Arial" w:hAnsi="Arial"/>
-                <w:sz w:val="22"/>
+                <w:sz w:val="21"/>
                 <w:rtl/>
               </w:rPr>
               <w:t>23. أواجه فرصة إلقاء الخطاب بثقة.</w:t>
@@ -3492,6 +3549,7 @@
           </w:tcPr>
           <w:p>
             <w:pPr>
+              <w:spacing w:before="40" w:after="40"/>
               <w:jc w:val="center"/>
             </w:pPr>
             <w:r>
@@ -3510,6 +3568,7 @@
           </w:tcPr>
           <w:p>
             <w:pPr>
+              <w:spacing w:before="40" w:after="40"/>
               <w:jc w:val="center"/>
             </w:pPr>
             <w:r>
@@ -3528,6 +3587,7 @@
           </w:tcPr>
           <w:p>
             <w:pPr>
+              <w:spacing w:before="40" w:after="40"/>
               <w:jc w:val="center"/>
             </w:pPr>
             <w:r>
@@ -3546,6 +3606,7 @@
           </w:tcPr>
           <w:p>
             <w:pPr>
+              <w:spacing w:before="40" w:after="40"/>
               <w:jc w:val="center"/>
             </w:pPr>
             <w:r>
@@ -3559,11 +3620,12 @@
         </w:tc>
         <w:tc>
           <w:tcPr>
-            <w:tcW w:type="dxa" w:w="1417"/>
+            <w:tcW w:type="dxa" w:w="1247"/>
             <w:vAlign w:val="center"/>
           </w:tcPr>
           <w:p>
             <w:pPr>
+              <w:spacing w:before="40" w:after="40"/>
               <w:jc w:val="center"/>
             </w:pPr>
             <w:r>
@@ -3579,7 +3641,7 @@
       <w:tr>
         <w:tc>
           <w:tcPr>
-            <w:tcW w:type="dxa" w:w="5386"/>
+            <w:tcW w:type="dxa" w:w="5556"/>
             <w:vAlign w:val="center"/>
             <w:shd w:val="clear" w:color="auto" w:fill="E8F5F3"/>
           </w:tcPr>
@@ -3592,7 +3654,7 @@
             <w:r>
               <w:rPr>
                 <w:rFonts w:ascii="Arial" w:hAnsi="Arial"/>
-                <w:sz w:val="22"/>
+                <w:sz w:val="21"/>
                 <w:rtl/>
               </w:rPr>
               <w:t>24. أثناء الخطاب، أصاب بتوتر شديد حتى أنسى حقائق أعرفها جيداً.</w:t>
@@ -3607,6 +3669,7 @@
           </w:tcPr>
           <w:p>
             <w:pPr>
+              <w:spacing w:before="40" w:after="40"/>
               <w:jc w:val="center"/>
             </w:pPr>
             <w:r>
@@ -3626,6 +3689,7 @@
           </w:tcPr>
           <w:p>
             <w:pPr>
+              <w:spacing w:before="40" w:after="40"/>
               <w:jc w:val="center"/>
             </w:pPr>
             <w:r>
@@ -3645,6 +3709,7 @@
           </w:tcPr>
           <w:p>
             <w:pPr>
+              <w:spacing w:before="40" w:after="40"/>
               <w:jc w:val="center"/>
             </w:pPr>
             <w:r>
@@ -3664,6 +3729,7 @@
           </w:tcPr>
           <w:p>
             <w:pPr>
+              <w:spacing w:before="40" w:after="40"/>
               <w:jc w:val="center"/>
             </w:pPr>
             <w:r>
@@ -3677,12 +3743,13 @@
         </w:tc>
         <w:tc>
           <w:tcPr>
-            <w:tcW w:type="dxa" w:w="1417"/>
+            <w:tcW w:type="dxa" w:w="1247"/>
             <w:vAlign w:val="center"/>
             <w:shd w:val="clear" w:color="auto" w:fill="E8F5F3"/>
           </w:tcPr>
           <w:p>
             <w:pPr>
+              <w:spacing w:before="40" w:after="40"/>
               <w:jc w:val="center"/>
             </w:pPr>
             <w:r>
@@ -3705,7 +3772,7 @@
     <w:p>
       <w:pPr>
         <w:bidi/>
-        <w:spacing w:before="200" w:after="120"/>
+        <w:spacing w:before="0" w:after="60"/>
         <w:jc w:val="center"/>
         <w:shd w:val="clear" w:color="auto" w:fill="007064"/>
       </w:pPr>
@@ -3714,10 +3781,10 @@
           <w:rFonts w:ascii="Arial" w:hAnsi="Arial"/>
           <w:b/>
           <w:color w:val="FFFFFF"/>
-          <w:sz w:val="30"/>
+          <w:sz w:val="28"/>
           <w:rtl/>
         </w:rPr>
-        <w:t>طريقة حساب الدرجات يدوياً</w:t>
+        <w:t>طريقة الحساب</w:t>
       </w:r>
     </w:p>
     <w:p>
@@ -3730,16 +3797,16 @@
         <w:rPr>
           <w:rFonts w:ascii="Arial" w:hAnsi="Arial"/>
           <w:b w:val="0"/>
-          <w:sz w:val="24"/>
+          <w:sz w:val="22"/>
           <w:rtl/>
         </w:rPr>
-        <w:t>بعد الإجابة على جميع العبارات، اتبع الخطوات التالية لحساب درجتك:</w:t>
+        <w:t>بعد الانتهاء من الإجابة، احسب درجتك لكل محور بالمعادلة التالية:</w:t>
       </w:r>
     </w:p>
     <w:p>
       <w:pPr>
         <w:bidi/>
-        <w:spacing w:before="200" w:after="120"/>
+        <w:spacing w:before="100" w:after="60"/>
         <w:jc w:val="center"/>
         <w:shd w:val="clear" w:color="auto" w:fill="008C7E"/>
       </w:pPr>
@@ -3751,45 +3818,46 @@
           <w:sz w:val="22"/>
           <w:rtl/>
         </w:rPr>
-        <w:t>1. المناقشات الجماعية  (أسئلة ١–٦)</w:t>
+        <w:t>المناقشات الجماعية</w:t>
       </w:r>
     </w:p>
     <w:p>
       <w:pPr>
         <w:bidi/>
-        <w:spacing w:before="80" w:after="40"/>
+        <w:spacing w:before="60" w:after="40"/>
         <w:jc w:val="right"/>
       </w:pPr>
       <w:r>
         <w:rPr>
           <w:rFonts w:ascii="Arial" w:hAnsi="Arial"/>
-          <w:b w:val="0"/>
+          <w:b/>
+          <w:color w:val="005048"/>
           <w:sz w:val="24"/>
           <w:rtl/>
         </w:rPr>
-        <w:t>المعادلة:  18 + (س٢ + س٤ + س٦) − (س١ + س٣ + س٥)</w:t>
+        <w:t>18 − (س٢ + س٤ + س٦)  +  (س١ + س٣ + س٥)</w:t>
       </w:r>
     </w:p>
     <w:p>
       <w:pPr>
         <w:bidi/>
-        <w:spacing w:before="0" w:after="160"/>
+        <w:spacing w:before="0" w:after="120"/>
         <w:jc w:val="right"/>
       </w:pPr>
       <w:r>
         <w:rPr>
           <w:rFonts w:ascii="Arial" w:hAnsi="Arial"/>
-          <w:b w:val="0"/>
+          <w:b/>
           <w:sz w:val="24"/>
           <w:rtl/>
         </w:rPr>
-        <w:t xml:space="preserve">      درجة المناقشات الجماعية = _________  (المدى: ٦ – ٣٠)</w:t>
+        <w:t>درجة المناقشات = ___________</w:t>
       </w:r>
     </w:p>
     <w:p>
       <w:pPr>
         <w:bidi/>
-        <w:spacing w:before="200" w:after="120"/>
+        <w:spacing w:before="100" w:after="60"/>
         <w:jc w:val="center"/>
         <w:shd w:val="clear" w:color="auto" w:fill="008C7E"/>
       </w:pPr>
@@ -3801,45 +3869,46 @@
           <w:sz w:val="22"/>
           <w:rtl/>
         </w:rPr>
-        <w:t>2. الاجتماعات  (أسئلة ٧–١٢)</w:t>
+        <w:t>الاجتماعات</w:t>
       </w:r>
     </w:p>
     <w:p>
       <w:pPr>
         <w:bidi/>
-        <w:spacing w:before="80" w:after="40"/>
+        <w:spacing w:before="60" w:after="40"/>
         <w:jc w:val="right"/>
       </w:pPr>
       <w:r>
         <w:rPr>
           <w:rFonts w:ascii="Arial" w:hAnsi="Arial"/>
-          <w:b w:val="0"/>
+          <w:b/>
+          <w:color w:val="005048"/>
           <w:sz w:val="24"/>
           <w:rtl/>
         </w:rPr>
-        <w:t>المعادلة:  18 + (س٨ + س٩ + س١٢) − (س٧ + س١٠ + س١١)</w:t>
+        <w:t>18 − (س٨ + س٩ + س١٢)  +  (س٧ + س١٠ + س١١)</w:t>
       </w:r>
     </w:p>
     <w:p>
       <w:pPr>
         <w:bidi/>
-        <w:spacing w:before="0" w:after="160"/>
+        <w:spacing w:before="0" w:after="120"/>
         <w:jc w:val="right"/>
       </w:pPr>
       <w:r>
         <w:rPr>
           <w:rFonts w:ascii="Arial" w:hAnsi="Arial"/>
-          <w:b w:val="0"/>
+          <w:b/>
           <w:sz w:val="24"/>
           <w:rtl/>
         </w:rPr>
-        <w:t xml:space="preserve">      درجة الاجتماعات = _________  (المدى: ٦ – ٣٠)</w:t>
+        <w:t>درجة الاجتماعات = ___________</w:t>
       </w:r>
     </w:p>
     <w:p>
       <w:pPr>
         <w:bidi/>
-        <w:spacing w:before="200" w:after="120"/>
+        <w:spacing w:before="100" w:after="60"/>
         <w:jc w:val="center"/>
         <w:shd w:val="clear" w:color="auto" w:fill="008C7E"/>
       </w:pPr>
@@ -3851,45 +3920,46 @@
           <w:sz w:val="22"/>
           <w:rtl/>
         </w:rPr>
-        <w:t>3. المحادثات الشخصية  (أسئلة ١٣–١٨)</w:t>
+        <w:t>المحادثات الشخصية</w:t>
       </w:r>
     </w:p>
     <w:p>
       <w:pPr>
         <w:bidi/>
-        <w:spacing w:before="80" w:after="40"/>
+        <w:spacing w:before="60" w:after="40"/>
         <w:jc w:val="right"/>
       </w:pPr>
       <w:r>
         <w:rPr>
           <w:rFonts w:ascii="Arial" w:hAnsi="Arial"/>
-          <w:b w:val="0"/>
+          <w:b/>
+          <w:color w:val="005048"/>
           <w:sz w:val="24"/>
           <w:rtl/>
         </w:rPr>
-        <w:t>المعادلة:  18 + (س١٤ + س١٦ + س١٧) − (س١٣ + س١٥ + س١٨)</w:t>
+        <w:t>18 − (س١٤ + س١٦ + س١٧)  +  (س١٣ + س١٥ + س١٨)</w:t>
       </w:r>
     </w:p>
     <w:p>
       <w:pPr>
         <w:bidi/>
-        <w:spacing w:before="0" w:after="160"/>
+        <w:spacing w:before="0" w:after="120"/>
         <w:jc w:val="right"/>
       </w:pPr>
       <w:r>
         <w:rPr>
           <w:rFonts w:ascii="Arial" w:hAnsi="Arial"/>
-          <w:b w:val="0"/>
+          <w:b/>
           <w:sz w:val="24"/>
           <w:rtl/>
         </w:rPr>
-        <w:t xml:space="preserve">      درجة المحادثات = _________  (المدى: ٦ – ٣٠)</w:t>
+        <w:t>درجة المحادثات = ___________</w:t>
       </w:r>
     </w:p>
     <w:p>
       <w:pPr>
         <w:bidi/>
-        <w:spacing w:before="200" w:after="120"/>
+        <w:spacing w:before="100" w:after="60"/>
         <w:jc w:val="center"/>
         <w:shd w:val="clear" w:color="auto" w:fill="008C7E"/>
       </w:pPr>
@@ -3901,45 +3971,46 @@
           <w:sz w:val="22"/>
           <w:rtl/>
         </w:rPr>
-        <w:t>4. الخطابة  (أسئلة ١٩–٢٤)</w:t>
+        <w:t>الخطابة أمام الجمهور</w:t>
       </w:r>
     </w:p>
     <w:p>
       <w:pPr>
         <w:bidi/>
-        <w:spacing w:before="80" w:after="40"/>
+        <w:spacing w:before="60" w:after="40"/>
         <w:jc w:val="right"/>
       </w:pPr>
       <w:r>
         <w:rPr>
           <w:rFonts w:ascii="Arial" w:hAnsi="Arial"/>
-          <w:b w:val="0"/>
+          <w:b/>
+          <w:color w:val="005048"/>
           <w:sz w:val="24"/>
           <w:rtl/>
         </w:rPr>
-        <w:t>المعادلة:  18 + (س١٩ + س٢١ + س٢٣) − (س٢٠ + س٢٢ + س٢٤)</w:t>
+        <w:t>18 − (س١٩ + س٢١ + س٢٣)  +  (س٢٠ + س٢٢ + س٢٤)</w:t>
       </w:r>
     </w:p>
     <w:p>
       <w:pPr>
         <w:bidi/>
-        <w:spacing w:before="0" w:after="160"/>
+        <w:spacing w:before="0" w:after="120"/>
         <w:jc w:val="right"/>
       </w:pPr>
       <w:r>
         <w:rPr>
           <w:rFonts w:ascii="Arial" w:hAnsi="Arial"/>
-          <w:b w:val="0"/>
+          <w:b/>
           <w:sz w:val="24"/>
           <w:rtl/>
         </w:rPr>
-        <w:t xml:space="preserve">      درجة الخطابة = _________  (المدى: ٦ – ٣٠)</w:t>
+        <w:t>درجة الخطابة = ___________</w:t>
       </w:r>
     </w:p>
     <w:p>
       <w:pPr>
         <w:bidi/>
-        <w:spacing w:before="200" w:after="120"/>
+        <w:spacing w:before="120" w:after="60"/>
         <w:jc w:val="center"/>
         <w:shd w:val="clear" w:color="auto" w:fill="005048"/>
       </w:pPr>
@@ -3957,7 +4028,7 @@
     <w:p>
       <w:pPr>
         <w:bidi/>
-        <w:spacing w:before="120" w:after="80"/>
+        <w:spacing w:before="80" w:after="60"/>
         <w:jc w:val="right"/>
       </w:pPr>
       <w:r>
@@ -3973,7 +4044,7 @@
     <w:p>
       <w:pPr>
         <w:bidi/>
-        <w:spacing w:before="0" w:after="200"/>
+        <w:spacing w:before="0" w:after="160"/>
         <w:jc w:val="right"/>
       </w:pPr>
       <w:r>
@@ -3984,13 +4055,13 @@
           <w:sz w:val="26"/>
           <w:rtl/>
         </w:rPr>
-        <w:t xml:space="preserve">      الدرجة الكلية = _________  (المدى: 24 – 120)</w:t>
+        <w:t>الدرجة الكلية = _______________      (المدى: 24 – 120)</w:t>
       </w:r>
     </w:p>
     <w:p>
       <w:pPr>
         <w:bidi/>
-        <w:spacing w:before="200" w:after="120"/>
+        <w:spacing w:before="120" w:after="60"/>
         <w:jc w:val="center"/>
         <w:shd w:val="clear" w:color="auto" w:fill="007064"/>
       </w:pPr>
@@ -3999,13 +4070,63 @@
           <w:rFonts w:ascii="Arial" w:hAnsi="Arial"/>
           <w:b/>
           <w:color w:val="FFFFFF"/>
-          <w:sz w:val="30"/>
+          <w:sz w:val="28"/>
           <w:rtl/>
         </w:rPr>
         <w:t>تفسير الدرجات</w:t>
       </w:r>
     </w:p>
-    <w:p/>
+    <w:p>
+      <w:pPr>
+        <w:bidi/>
+        <w:spacing w:before="80" w:after="160"/>
+        <w:jc w:val="right"/>
+      </w:pPr>
+      <w:r>
+        <w:rPr>
+          <w:rFonts w:ascii="Arial" w:hAnsi="Arial"/>
+          <w:b w:val="0"/>
+          <w:sz w:val="22"/>
+          <w:rtl/>
+        </w:rPr>
+        <w:t>الدرجات دون 51 تمثل أفراداً لديهم قلق تواصل منخفض جداً. الدرجات بين 51 و80 تمثل أفراداً لديهم قلق تواصل متوسط. الدرجات فوق 80 تمثل أفراداً لديهم مستويات مرتفعة من قلق التواصل السمة.</w:t>
+      </w:r>
+    </w:p>
+    <w:p>
+      <w:pPr>
+        <w:bidi/>
+        <w:spacing w:before="80" w:after="60"/>
+        <w:jc w:val="center"/>
+        <w:shd w:val="clear" w:color="auto" w:fill="007064"/>
+      </w:pPr>
+      <w:r>
+        <w:rPr>
+          <w:rFonts w:ascii="Arial" w:hAnsi="Arial"/>
+          <w:b/>
+          <w:color w:val="FFFFFF"/>
+          <w:sz w:val="26"/>
+          <w:rtl/>
+        </w:rPr>
+        <w:t>المعايير المرجعية للمقياس PRCA-24</w:t>
+      </w:r>
+    </w:p>
+    <w:p>
+      <w:pPr>
+        <w:bidi/>
+        <w:spacing w:before="60" w:after="100"/>
+        <w:jc w:val="right"/>
+      </w:pPr>
+      <w:r>
+        <w:rPr>
+          <w:rFonts w:ascii="Arial" w:hAnsi="Arial"/>
+          <w:b w:val="0"/>
+          <w:color w:val="646464"/>
+          <w:sz w:val="18"/>
+          <w:rtl/>
+        </w:rPr>
+        <w:t>(مبنية على بيانات أكثر من 40,000 طالب جامعي، وبيانات أكثر من 3,000 بالغ من غير الطلاب في عينة وطنية — النتائج متطابقة تقريباً في كلا المجموعتين بفارق لا يتجاوز 0.20 لجميع الدرجات.)</w:t>
+      </w:r>
+    </w:p>
     <w:tbl>
       <w:tblPr>
         <w:tblStyle w:val="TableGrid"/>
@@ -4014,19 +4135,21 @@
         <w:tblLook w:firstColumn="1" w:firstRow="1" w:lastColumn="0" w:lastRow="0" w:noHBand="0" w:noVBand="1" w:val="04A0"/>
       </w:tblPr>
       <w:tblGrid>
-        <w:gridCol w:w="3024"/>
-        <w:gridCol w:w="3024"/>
-        <w:gridCol w:w="3024"/>
+        <w:gridCol w:w="1882"/>
+        <w:gridCol w:w="1882"/>
+        <w:gridCol w:w="1882"/>
+        <w:gridCol w:w="1882"/>
+        <w:gridCol w:w="1882"/>
       </w:tblGrid>
       <w:tr>
         <w:tc>
           <w:tcPr>
-            <w:tcW w:type="dxa" w:w="2551"/>
-            <w:vAlign w:val="center"/>
+            <w:tcW w:type="dxa" w:w="2948"/>
             <w:shd w:val="clear" w:color="auto" w:fill="007064"/>
           </w:tcPr>
           <w:p>
             <w:pPr>
+              <w:spacing w:before="40" w:after="40"/>
               <w:jc w:val="center"/>
             </w:pPr>
             <w:r>
@@ -4034,7 +4157,122 @@
                 <w:rFonts w:ascii="Arial" w:hAnsi="Arial"/>
                 <w:b/>
                 <w:color w:val="FFFFFF"/>
-                <w:sz w:val="24"/>
+                <w:sz w:val="20"/>
+                <w:rtl/>
+              </w:rPr>
+              <w:t>المحور / الدرجة</w:t>
+            </w:r>
+          </w:p>
+        </w:tc>
+        <w:tc>
+          <w:tcPr>
+            <w:tcW w:type="dxa" w:w="1814"/>
+            <w:shd w:val="clear" w:color="auto" w:fill="007064"/>
+          </w:tcPr>
+          <w:p>
+            <w:pPr>
+              <w:spacing w:before="40" w:after="40"/>
+              <w:jc w:val="center"/>
+            </w:pPr>
+            <w:r>
+              <w:rPr>
+                <w:rFonts w:ascii="Arial" w:hAnsi="Arial"/>
+                <w:b/>
+                <w:color w:val="FFFFFF"/>
+                <w:sz w:val="20"/>
+                <w:rtl/>
+              </w:rPr>
+              <w:t>المتوسط</w:t>
+            </w:r>
+          </w:p>
+        </w:tc>
+        <w:tc>
+          <w:tcPr>
+            <w:tcW w:type="dxa" w:w="2154"/>
+            <w:shd w:val="clear" w:color="auto" w:fill="007064"/>
+          </w:tcPr>
+          <w:p>
+            <w:pPr>
+              <w:spacing w:before="40" w:after="40"/>
+              <w:jc w:val="center"/>
+            </w:pPr>
+            <w:r>
+              <w:rPr>
+                <w:rFonts w:ascii="Arial" w:hAnsi="Arial"/>
+                <w:b/>
+                <w:color w:val="FFFFFF"/>
+                <w:sz w:val="20"/>
+                <w:rtl/>
+              </w:rPr>
+              <w:t>الانحراف المعياري</w:t>
+            </w:r>
+          </w:p>
+        </w:tc>
+        <w:tc>
+          <w:tcPr>
+            <w:tcW w:type="dxa" w:w="1587"/>
+            <w:shd w:val="clear" w:color="auto" w:fill="007064"/>
+          </w:tcPr>
+          <w:p>
+            <w:pPr>
+              <w:spacing w:before="40" w:after="40"/>
+              <w:jc w:val="center"/>
+            </w:pPr>
+            <w:r>
+              <w:rPr>
+                <w:rFonts w:ascii="Arial" w:hAnsi="Arial"/>
+                <w:b/>
+                <w:color w:val="FFFFFF"/>
+                <w:sz w:val="20"/>
+                <w:rtl/>
+              </w:rPr>
+              <w:t>مرتفع</w:t>
+            </w:r>
+          </w:p>
+        </w:tc>
+        <w:tc>
+          <w:tcPr>
+            <w:tcW w:type="dxa" w:w="1701"/>
+            <w:shd w:val="clear" w:color="auto" w:fill="007064"/>
+          </w:tcPr>
+          <w:p>
+            <w:pPr>
+              <w:spacing w:before="40" w:after="40"/>
+              <w:jc w:val="center"/>
+            </w:pPr>
+            <w:r>
+              <w:rPr>
+                <w:rFonts w:ascii="Arial" w:hAnsi="Arial"/>
+                <w:b/>
+                <w:color w:val="FFFFFF"/>
+                <w:sz w:val="20"/>
+                <w:rtl/>
+              </w:rPr>
+              <w:t>منخفض</w:t>
+            </w:r>
+          </w:p>
+        </w:tc>
+      </w:tr>
+      <w:tr>
+        <w:tc>
+          <w:tcPr>
+            <w:tcW w:type="dxa" w:w="2948"/>
+            <w:shd w:val="clear" w:color="auto" w:fill="FFFFFF"/>
+            <w:vAlign w:val="center"/>
+          </w:tcPr>
+          <w:p>
+            <w:pPr>
+              <w:bidi/>
+              <w:spacing w:before="40" w:after="40"/>
+              <w:jc w:val="right"/>
+            </w:pPr>
+            <w:r>
+              <w:rPr>
+                <w:rFonts w:ascii="Arial" w:hAnsi="Arial"/>
+                <w:b/>
+                <w:color w:val="005048"/>
+                <w:sz w:val="20"/>
+                <w:rtl/>
               </w:rPr>
               <w:t>الدرجة الكلية</w:t>
             </w:r>
@@ -4042,43 +4280,97 @@
         </w:tc>
         <w:tc>
           <w:tcPr>
-            <w:tcW w:type="dxa" w:w="2551"/>
+            <w:tcW w:type="dxa" w:w="1814"/>
+            <w:shd w:val="clear" w:color="auto" w:fill="FFFFFF"/>
             <w:vAlign w:val="center"/>
-            <w:shd w:val="clear" w:color="auto" w:fill="007064"/>
           </w:tcPr>
           <w:p>
             <w:pPr>
+              <w:bidi/>
+              <w:spacing w:before="40" w:after="40"/>
               <w:jc w:val="center"/>
             </w:pPr>
             <w:r>
               <w:rPr>
                 <w:rFonts w:ascii="Arial" w:hAnsi="Arial"/>
-                <w:b/>
-                <w:color w:val="FFFFFF"/>
-                <w:sz w:val="24"/>
+                <w:b w:val="0"/>
+                <w:color w:val="1E1E1E"/>
+                <w:sz w:val="20"/>
+                <w:rtl/>
               </w:rPr>
-              <w:t>مستوى القلق</w:t>
+              <w:t>65.6</w:t>
             </w:r>
           </w:p>
         </w:tc>
         <w:tc>
           <w:tcPr>
-            <w:tcW w:type="dxa" w:w="5102"/>
+            <w:tcW w:type="dxa" w:w="2154"/>
+            <w:shd w:val="clear" w:color="auto" w:fill="FFFFFF"/>
             <w:vAlign w:val="center"/>
-            <w:shd w:val="clear" w:color="auto" w:fill="007064"/>
           </w:tcPr>
           <w:p>
             <w:pPr>
+              <w:bidi/>
+              <w:spacing w:before="40" w:after="40"/>
               <w:jc w:val="center"/>
             </w:pPr>
             <w:r>
               <w:rPr>
                 <w:rFonts w:ascii="Arial" w:hAnsi="Arial"/>
-                <w:b/>
-                <w:color w:val="FFFFFF"/>
-                <w:sz w:val="24"/>
+                <w:b w:val="0"/>
+                <w:color w:val="1E1E1E"/>
+                <w:sz w:val="20"/>
+                <w:rtl/>
               </w:rPr>
-              <w:t>التفسير</w:t>
+              <w:t>15.3</w:t>
+            </w:r>
+          </w:p>
+        </w:tc>
+        <w:tc>
+          <w:tcPr>
+            <w:tcW w:type="dxa" w:w="1587"/>
+            <w:shd w:val="clear" w:color="auto" w:fill="FFFFFF"/>
+            <w:vAlign w:val="center"/>
+          </w:tcPr>
+          <w:p>
+            <w:pPr>
+              <w:bidi/>
+              <w:spacing w:before="40" w:after="40"/>
+              <w:jc w:val="center"/>
+            </w:pPr>
+            <w:r>
+              <w:rPr>
+                <w:rFonts w:ascii="Arial" w:hAnsi="Arial"/>
+                <w:b w:val="0"/>
+                <w:color w:val="1E1E1E"/>
+                <w:sz w:val="20"/>
+                <w:rtl/>
+              </w:rPr>
+              <w:t>&gt; 80</w:t>
+            </w:r>
+          </w:p>
+        </w:tc>
+        <w:tc>
+          <w:tcPr>
+            <w:tcW w:type="dxa" w:w="1701"/>
+            <w:shd w:val="clear" w:color="auto" w:fill="FFFFFF"/>
+            <w:vAlign w:val="center"/>
+          </w:tcPr>
+          <w:p>
+            <w:pPr>
+              <w:bidi/>
+              <w:spacing w:before="40" w:after="40"/>
+              <w:jc w:val="center"/>
+            </w:pPr>
+            <w:r>
+              <w:rPr>
+                <w:rFonts w:ascii="Arial" w:hAnsi="Arial"/>
+                <w:b w:val="0"/>
+                <w:color w:val="1E1E1E"/>
+                <w:sz w:val="20"/>
+                <w:rtl/>
+              </w:rPr>
+              <w:t>&lt; 51</w:t>
             </w:r>
           </w:p>
         </w:tc>
@@ -4086,69 +4378,121 @@
       <w:tr>
         <w:tc>
           <w:tcPr>
-            <w:tcW w:type="dxa" w:w="2551"/>
+            <w:tcW w:type="dxa" w:w="2948"/>
+            <w:shd w:val="clear" w:color="auto" w:fill="E8F5F3"/>
             <w:vAlign w:val="center"/>
-            <w:shd w:val="clear" w:color="auto" w:fill="D1F5EE"/>
           </w:tcPr>
           <w:p>
             <w:pPr>
-              <w:spacing w:before="80" w:after="80"/>
+              <w:bidi/>
+              <w:spacing w:before="40" w:after="40"/>
+              <w:jc w:val="right"/>
+            </w:pPr>
+            <w:r>
+              <w:rPr>
+                <w:rFonts w:ascii="Arial" w:hAnsi="Arial"/>
+                <w:b/>
+                <w:color w:val="005048"/>
+                <w:sz w:val="20"/>
+                <w:rtl/>
+              </w:rPr>
+              <w:t>المناقشات الجماعية</w:t>
+            </w:r>
+          </w:p>
+        </w:tc>
+        <w:tc>
+          <w:tcPr>
+            <w:tcW w:type="dxa" w:w="1814"/>
+            <w:shd w:val="clear" w:color="auto" w:fill="E8F5F3"/>
+            <w:vAlign w:val="center"/>
+          </w:tcPr>
+          <w:p>
+            <w:pPr>
+              <w:bidi/>
+              <w:spacing w:before="40" w:after="40"/>
               <w:jc w:val="center"/>
             </w:pPr>
             <w:r>
               <w:rPr>
                 <w:rFonts w:ascii="Arial" w:hAnsi="Arial"/>
-                <w:b/>
-                <w:color w:val="007064"/>
-                <w:sz w:val="22"/>
+                <w:b w:val="0"/>
+                <w:color w:val="1E1E1E"/>
+                <w:sz w:val="20"/>
+                <w:rtl/>
               </w:rPr>
-              <w:t>أقل من 51</w:t>
+              <w:t>15.4</w:t>
             </w:r>
           </w:p>
         </w:tc>
         <w:tc>
           <w:tcPr>
-            <w:tcW w:type="dxa" w:w="2551"/>
+            <w:tcW w:type="dxa" w:w="2154"/>
+            <w:shd w:val="clear" w:color="auto" w:fill="E8F5F3"/>
             <w:vAlign w:val="center"/>
-            <w:shd w:val="clear" w:color="auto" w:fill="D1F5EE"/>
           </w:tcPr>
           <w:p>
             <w:pPr>
-              <w:spacing w:before="80" w:after="80"/>
+              <w:bidi/>
+              <w:spacing w:before="40" w:after="40"/>
               <w:jc w:val="center"/>
             </w:pPr>
             <w:r>
               <w:rPr>
                 <w:rFonts w:ascii="Arial" w:hAnsi="Arial"/>
-                <w:b/>
-                <w:color w:val="007064"/>
-                <w:sz w:val="22"/>
+                <w:b w:val="0"/>
+                <w:color w:val="1E1E1E"/>
+                <w:sz w:val="20"/>
+                <w:rtl/>
               </w:rPr>
-              <w:t>قلق منخفض</w:t>
+              <w:t>4.8</w:t>
             </w:r>
           </w:p>
         </w:tc>
         <w:tc>
           <w:tcPr>
-            <w:tcW w:type="dxa" w:w="5102"/>
+            <w:tcW w:type="dxa" w:w="1587"/>
+            <w:shd w:val="clear" w:color="auto" w:fill="E8F5F3"/>
             <w:vAlign w:val="center"/>
-            <w:shd w:val="clear" w:color="auto" w:fill="D1F5EE"/>
           </w:tcPr>
           <w:p>
             <w:pPr>
-              <w:spacing w:before="80" w:after="80"/>
-              <w:jc w:val="right"/>
               <w:bidi/>
-              <w:jc w:val="right"/>
+              <w:spacing w:before="40" w:after="40"/>
+              <w:jc w:val="center"/>
             </w:pPr>
             <w:r>
               <w:rPr>
                 <w:rFonts w:ascii="Arial" w:hAnsi="Arial"/>
                 <w:b w:val="0"/>
-                <w:color w:val="007064"/>
-                <w:sz w:val="22"/>
+                <w:color w:val="1E1E1E"/>
+                <w:sz w:val="20"/>
+                <w:rtl/>
               </w:rPr>
-              <w:t>تتمتع بثقة عالية في التواصل مع الآخرين. التواصل يُشكّل قوة لديك.</w:t>
+              <w:t>&gt; 20</w:t>
+            </w:r>
+          </w:p>
+        </w:tc>
+        <w:tc>
+          <w:tcPr>
+            <w:tcW w:type="dxa" w:w="1701"/>
+            <w:shd w:val="clear" w:color="auto" w:fill="E8F5F3"/>
+            <w:vAlign w:val="center"/>
+          </w:tcPr>
+          <w:p>
+            <w:pPr>
+              <w:bidi/>
+              <w:spacing w:before="40" w:after="40"/>
+              <w:jc w:val="center"/>
+            </w:pPr>
+            <w:r>
+              <w:rPr>
+                <w:rFonts w:ascii="Arial" w:hAnsi="Arial"/>
+                <w:b w:val="0"/>
+                <w:color w:val="1E1E1E"/>
+                <w:sz w:val="20"/>
+                <w:rtl/>
+              </w:rPr>
+              <w:t>&lt; 11</w:t>
             </w:r>
           </w:p>
         </w:tc>
@@ -4156,69 +4500,121 @@
       <w:tr>
         <w:tc>
           <w:tcPr>
-            <w:tcW w:type="dxa" w:w="2551"/>
+            <w:tcW w:type="dxa" w:w="2948"/>
+            <w:shd w:val="clear" w:color="auto" w:fill="FFFFFF"/>
             <w:vAlign w:val="center"/>
-            <w:shd w:val="clear" w:color="auto" w:fill="FFF8E1"/>
           </w:tcPr>
           <w:p>
             <w:pPr>
-              <w:spacing w:before="80" w:after="80"/>
+              <w:bidi/>
+              <w:spacing w:before="40" w:after="40"/>
+              <w:jc w:val="right"/>
+            </w:pPr>
+            <w:r>
+              <w:rPr>
+                <w:rFonts w:ascii="Arial" w:hAnsi="Arial"/>
+                <w:b/>
+                <w:color w:val="005048"/>
+                <w:sz w:val="20"/>
+                <w:rtl/>
+              </w:rPr>
+              <w:t>الاجتماعات</w:t>
+            </w:r>
+          </w:p>
+        </w:tc>
+        <w:tc>
+          <w:tcPr>
+            <w:tcW w:type="dxa" w:w="1814"/>
+            <w:shd w:val="clear" w:color="auto" w:fill="FFFFFF"/>
+            <w:vAlign w:val="center"/>
+          </w:tcPr>
+          <w:p>
+            <w:pPr>
+              <w:bidi/>
+              <w:spacing w:before="40" w:after="40"/>
               <w:jc w:val="center"/>
             </w:pPr>
             <w:r>
               <w:rPr>
                 <w:rFonts w:ascii="Arial" w:hAnsi="Arial"/>
-                <w:b/>
-                <w:color w:val="B8860B"/>
-                <w:sz w:val="22"/>
+                <w:b w:val="0"/>
+                <w:color w:val="1E1E1E"/>
+                <w:sz w:val="20"/>
+                <w:rtl/>
               </w:rPr>
-              <w:t>51 – 80</w:t>
+              <w:t>16.4</w:t>
             </w:r>
           </w:p>
         </w:tc>
         <w:tc>
           <w:tcPr>
-            <w:tcW w:type="dxa" w:w="2551"/>
+            <w:tcW w:type="dxa" w:w="2154"/>
+            <w:shd w:val="clear" w:color="auto" w:fill="FFFFFF"/>
             <w:vAlign w:val="center"/>
-            <w:shd w:val="clear" w:color="auto" w:fill="FFF8E1"/>
           </w:tcPr>
           <w:p>
             <w:pPr>
-              <w:spacing w:before="80" w:after="80"/>
+              <w:bidi/>
+              <w:spacing w:before="40" w:after="40"/>
               <w:jc w:val="center"/>
             </w:pPr>
             <w:r>
               <w:rPr>
                 <w:rFonts w:ascii="Arial" w:hAnsi="Arial"/>
-                <w:b/>
-                <w:color w:val="B8860B"/>
-                <w:sz w:val="22"/>
+                <w:b w:val="0"/>
+                <w:color w:val="1E1E1E"/>
+                <w:sz w:val="20"/>
+                <w:rtl/>
               </w:rPr>
-              <w:t>قلق متوسط</w:t>
+              <w:t>4.2</w:t>
             </w:r>
           </w:p>
         </w:tc>
         <w:tc>
           <w:tcPr>
-            <w:tcW w:type="dxa" w:w="5102"/>
+            <w:tcW w:type="dxa" w:w="1587"/>
+            <w:shd w:val="clear" w:color="auto" w:fill="FFFFFF"/>
             <w:vAlign w:val="center"/>
-            <w:shd w:val="clear" w:color="auto" w:fill="FFF8E1"/>
           </w:tcPr>
           <w:p>
             <w:pPr>
-              <w:spacing w:before="80" w:after="80"/>
-              <w:jc w:val="right"/>
               <w:bidi/>
-              <w:jc w:val="right"/>
+              <w:spacing w:before="40" w:after="40"/>
+              <w:jc w:val="center"/>
             </w:pPr>
             <w:r>
               <w:rPr>
                 <w:rFonts w:ascii="Arial" w:hAnsi="Arial"/>
                 <w:b w:val="0"/>
-                <w:color w:val="B8860B"/>
-                <w:sz w:val="22"/>
+                <w:color w:val="1E1E1E"/>
+                <w:sz w:val="20"/>
+                <w:rtl/>
               </w:rPr>
-              <w:t>تقع ضمن النطاق الطبيعي. قد تشعر ببعض القلق في مواقف معينة.</w:t>
+              <w:t>&gt; 20</w:t>
+            </w:r>
+          </w:p>
+        </w:tc>
+        <w:tc>
+          <w:tcPr>
+            <w:tcW w:type="dxa" w:w="1701"/>
+            <w:shd w:val="clear" w:color="auto" w:fill="FFFFFF"/>
+            <w:vAlign w:val="center"/>
+          </w:tcPr>
+          <w:p>
+            <w:pPr>
+              <w:bidi/>
+              <w:spacing w:before="40" w:after="40"/>
+              <w:jc w:val="center"/>
+            </w:pPr>
+            <w:r>
+              <w:rPr>
+                <w:rFonts w:ascii="Arial" w:hAnsi="Arial"/>
+                <w:b w:val="0"/>
+                <w:color w:val="1E1E1E"/>
+                <w:sz w:val="20"/>
+                <w:rtl/>
+              </w:rPr>
+              <w:t>&lt; 13</w:t>
             </w:r>
           </w:p>
         </w:tc>
@@ -4226,91 +4622,266 @@
       <w:tr>
         <w:tc>
           <w:tcPr>
-            <w:tcW w:type="dxa" w:w="2551"/>
+            <w:tcW w:type="dxa" w:w="2948"/>
+            <w:shd w:val="clear" w:color="auto" w:fill="E8F5F3"/>
             <w:vAlign w:val="center"/>
-            <w:shd w:val="clear" w:color="auto" w:fill="FFE8E8"/>
           </w:tcPr>
           <w:p>
             <w:pPr>
-              <w:spacing w:before="80" w:after="80"/>
+              <w:bidi/>
+              <w:spacing w:before="40" w:after="40"/>
+              <w:jc w:val="right"/>
+            </w:pPr>
+            <w:r>
+              <w:rPr>
+                <w:rFonts w:ascii="Arial" w:hAnsi="Arial"/>
+                <w:b/>
+                <w:color w:val="005048"/>
+                <w:sz w:val="20"/>
+                <w:rtl/>
+              </w:rPr>
+              <w:t>المحادثات (الثنائية)</w:t>
+            </w:r>
+          </w:p>
+        </w:tc>
+        <w:tc>
+          <w:tcPr>
+            <w:tcW w:type="dxa" w:w="1814"/>
+            <w:shd w:val="clear" w:color="auto" w:fill="E8F5F3"/>
+            <w:vAlign w:val="center"/>
+          </w:tcPr>
+          <w:p>
+            <w:pPr>
+              <w:bidi/>
+              <w:spacing w:before="40" w:after="40"/>
               <w:jc w:val="center"/>
             </w:pPr>
             <w:r>
               <w:rPr>
                 <w:rFonts w:ascii="Arial" w:hAnsi="Arial"/>
-                <w:b/>
-                <w:color w:val="C0392B"/>
-                <w:sz w:val="22"/>
+                <w:b w:val="0"/>
+                <w:color w:val="1E1E1E"/>
+                <w:sz w:val="20"/>
+                <w:rtl/>
               </w:rPr>
-              <w:t>أكثر من 80</w:t>
+              <w:t>14.2</w:t>
             </w:r>
           </w:p>
         </w:tc>
         <w:tc>
           <w:tcPr>
-            <w:tcW w:type="dxa" w:w="2551"/>
+            <w:tcW w:type="dxa" w:w="2154"/>
+            <w:shd w:val="clear" w:color="auto" w:fill="E8F5F3"/>
             <w:vAlign w:val="center"/>
-            <w:shd w:val="clear" w:color="auto" w:fill="FFE8E8"/>
           </w:tcPr>
           <w:p>
             <w:pPr>
-              <w:spacing w:before="80" w:after="80"/>
+              <w:bidi/>
+              <w:spacing w:before="40" w:after="40"/>
               <w:jc w:val="center"/>
             </w:pPr>
             <w:r>
               <w:rPr>
                 <w:rFonts w:ascii="Arial" w:hAnsi="Arial"/>
-                <w:b/>
-                <w:color w:val="C0392B"/>
-                <w:sz w:val="22"/>
+                <w:b w:val="0"/>
+                <w:color w:val="1E1E1E"/>
+                <w:sz w:val="20"/>
+                <w:rtl/>
               </w:rPr>
-              <w:t>قلق مرتفع</w:t>
+              <w:t>3.9</w:t>
             </w:r>
           </w:p>
         </w:tc>
         <w:tc>
           <w:tcPr>
-            <w:tcW w:type="dxa" w:w="5102"/>
+            <w:tcW w:type="dxa" w:w="1587"/>
+            <w:shd w:val="clear" w:color="auto" w:fill="E8F5F3"/>
             <w:vAlign w:val="center"/>
-            <w:shd w:val="clear" w:color="auto" w:fill="FFE8E8"/>
           </w:tcPr>
           <w:p>
             <w:pPr>
-              <w:spacing w:before="80" w:after="80"/>
-              <w:jc w:val="right"/>
               <w:bidi/>
+              <w:spacing w:before="40" w:after="40"/>
+              <w:jc w:val="center"/>
+            </w:pPr>
+            <w:r>
+              <w:rPr>
+                <w:rFonts w:ascii="Arial" w:hAnsi="Arial"/>
+                <w:b w:val="0"/>
+                <w:color w:val="1E1E1E"/>
+                <w:sz w:val="20"/>
+                <w:rtl/>
+              </w:rPr>
+              <w:t>&gt; 18</w:t>
+            </w:r>
+          </w:p>
+        </w:tc>
+        <w:tc>
+          <w:tcPr>
+            <w:tcW w:type="dxa" w:w="1701"/>
+            <w:shd w:val="clear" w:color="auto" w:fill="E8F5F3"/>
+            <w:vAlign w:val="center"/>
+          </w:tcPr>
+          <w:p>
+            <w:pPr>
+              <w:bidi/>
+              <w:spacing w:before="40" w:after="40"/>
+              <w:jc w:val="center"/>
+            </w:pPr>
+            <w:r>
+              <w:rPr>
+                <w:rFonts w:ascii="Arial" w:hAnsi="Arial"/>
+                <w:b w:val="0"/>
+                <w:color w:val="1E1E1E"/>
+                <w:sz w:val="20"/>
+                <w:rtl/>
+              </w:rPr>
+              <w:t>&lt; 11</w:t>
+            </w:r>
+          </w:p>
+        </w:tc>
+      </w:tr>
+      <w:tr>
+        <w:tc>
+          <w:tcPr>
+            <w:tcW w:type="dxa" w:w="2948"/>
+            <w:shd w:val="clear" w:color="auto" w:fill="FFFFFF"/>
+            <w:vAlign w:val="center"/>
+          </w:tcPr>
+          <w:p>
+            <w:pPr>
+              <w:bidi/>
+              <w:spacing w:before="40" w:after="40"/>
               <w:jc w:val="right"/>
             </w:pPr>
             <w:r>
               <w:rPr>
                 <w:rFonts w:ascii="Arial" w:hAnsi="Arial"/>
+                <w:b/>
+                <w:color w:val="005048"/>
+                <w:sz w:val="20"/>
+                <w:rtl/>
+              </w:rPr>
+              <w:t>الخطابة أمام الجمهور</w:t>
+            </w:r>
+          </w:p>
+        </w:tc>
+        <w:tc>
+          <w:tcPr>
+            <w:tcW w:type="dxa" w:w="1814"/>
+            <w:shd w:val="clear" w:color="auto" w:fill="FFFFFF"/>
+            <w:vAlign w:val="center"/>
+          </w:tcPr>
+          <w:p>
+            <w:pPr>
+              <w:bidi/>
+              <w:spacing w:before="40" w:after="40"/>
+              <w:jc w:val="center"/>
+            </w:pPr>
+            <w:r>
+              <w:rPr>
+                <w:rFonts w:ascii="Arial" w:hAnsi="Arial"/>
                 <w:b w:val="0"/>
-                <w:color w:val="C0392B"/>
-                <w:sz w:val="22"/>
+                <w:color w:val="1E1E1E"/>
+                <w:sz w:val="20"/>
+                <w:rtl/>
               </w:rPr>
-              <w:t>تجد صعوبة ملحوظة في التواصل. ينصح بالتدريب على مهارات التواصل.</w:t>
+              <w:t>19.3</w:t>
+            </w:r>
+          </w:p>
+        </w:tc>
+        <w:tc>
+          <w:tcPr>
+            <w:tcW w:type="dxa" w:w="2154"/>
+            <w:shd w:val="clear" w:color="auto" w:fill="FFFFFF"/>
+            <w:vAlign w:val="center"/>
+          </w:tcPr>
+          <w:p>
+            <w:pPr>
+              <w:bidi/>
+              <w:spacing w:before="40" w:after="40"/>
+              <w:jc w:val="center"/>
+            </w:pPr>
+            <w:r>
+              <w:rPr>
+                <w:rFonts w:ascii="Arial" w:hAnsi="Arial"/>
+                <w:b w:val="0"/>
+                <w:color w:val="1E1E1E"/>
+                <w:sz w:val="20"/>
+                <w:rtl/>
+              </w:rPr>
+              <w:t>5.1</w:t>
+            </w:r>
+          </w:p>
+        </w:tc>
+        <w:tc>
+          <w:tcPr>
+            <w:tcW w:type="dxa" w:w="1587"/>
+            <w:shd w:val="clear" w:color="auto" w:fill="FFFFFF"/>
+            <w:vAlign w:val="center"/>
+          </w:tcPr>
+          <w:p>
+            <w:pPr>
+              <w:bidi/>
+              <w:spacing w:before="40" w:after="40"/>
+              <w:jc w:val="center"/>
+            </w:pPr>
+            <w:r>
+              <w:rPr>
+                <w:rFonts w:ascii="Arial" w:hAnsi="Arial"/>
+                <w:b w:val="0"/>
+                <w:color w:val="1E1E1E"/>
+                <w:sz w:val="20"/>
+                <w:rtl/>
+              </w:rPr>
+              <w:t>&gt; 24</w:t>
+            </w:r>
+          </w:p>
+        </w:tc>
+        <w:tc>
+          <w:tcPr>
+            <w:tcW w:type="dxa" w:w="1701"/>
+            <w:shd w:val="clear" w:color="auto" w:fill="FFFFFF"/>
+            <w:vAlign w:val="center"/>
+          </w:tcPr>
+          <w:p>
+            <w:pPr>
+              <w:bidi/>
+              <w:spacing w:before="40" w:after="40"/>
+              <w:jc w:val="center"/>
+            </w:pPr>
+            <w:r>
+              <w:rPr>
+                <w:rFonts w:ascii="Arial" w:hAnsi="Arial"/>
+                <w:b w:val="0"/>
+                <w:color w:val="1E1E1E"/>
+                <w:sz w:val="20"/>
+                <w:rtl/>
+              </w:rPr>
+              <w:t>&lt; 14</w:t>
             </w:r>
           </w:p>
         </w:tc>
       </w:tr>
     </w:tbl>
     <w:p/>
+    <w:p/>
     <w:p>
       <w:pPr>
         <w:bidi/>
-        <w:spacing w:before="200" w:after="120"/>
+        <w:spacing w:before="160" w:after="60"/>
         <w:jc w:val="center"/>
-        <w:shd w:val="clear" w:color="auto" w:fill="007064"/>
+        <w:shd w:val="clear" w:color="auto" w:fill="005048"/>
       </w:pPr>
       <w:r>
         <w:rPr>
           <w:rFonts w:ascii="Arial" w:hAnsi="Arial"/>
           <w:b/>
           <w:color w:val="FFFFFF"/>
-          <w:sz w:val="24"/>
+          <w:sz w:val="22"/>
           <w:rtl/>
         </w:rPr>
-        <w:t>مدى درجات المحاور الفرعية</w:t>
+        <w:t>المرجع</w:t>
       </w:r>
     </w:p>
     <w:p>
@@ -4322,100 +4893,25 @@
       <w:r>
         <w:rPr>
           <w:rFonts w:ascii="Arial" w:hAnsi="Arial"/>
-          <w:b w:val="0"/>
-          <w:sz w:val="24"/>
+          <w:b/>
+          <w:color w:val="005048"/>
+          <w:sz w:val="20"/>
           <w:rtl/>
         </w:rPr>
-        <w:t>كل محور تتراوح درجاته بين 6 و30:</w:t>
+        <w:t xml:space="preserve">المصدر: </w:t>
       </w:r>
-    </w:p>
-    <w:p>
-      <w:pPr>
-        <w:bidi/>
-        <w:spacing w:before="40" w:after="40"/>
-        <w:jc w:val="right"/>
-      </w:pPr>
       <w:r>
         <w:rPr>
           <w:rFonts w:ascii="Arial" w:hAnsi="Arial"/>
-          <w:b w:val="0"/>
-          <w:sz w:val="24"/>
-          <w:rtl/>
+          <w:color w:val="3C3C3C"/>
+          <w:sz w:val="20"/>
         </w:rPr>
-        <w:t>• 6 – 17 : قلق منخفض في هذا السياق</w:t>
-      </w:r>
-    </w:p>
-    <w:p>
-      <w:pPr>
-        <w:bidi/>
-        <w:spacing w:before="40" w:after="40"/>
-        <w:jc w:val="right"/>
-      </w:pPr>
-      <w:r>
-        <w:rPr>
-          <w:rFonts w:ascii="Arial" w:hAnsi="Arial"/>
-          <w:b w:val="0"/>
-          <w:sz w:val="24"/>
-          <w:rtl/>
-        </w:rPr>
-        <w:t>• 18 – 24 : قلق متوسط في هذا السياق</w:t>
-      </w:r>
-    </w:p>
-    <w:p>
-      <w:pPr>
-        <w:bidi/>
-        <w:spacing w:before="40" w:after="40"/>
-        <w:jc w:val="right"/>
-      </w:pPr>
-      <w:r>
-        <w:rPr>
-          <w:rFonts w:ascii="Arial" w:hAnsi="Arial"/>
-          <w:b w:val="0"/>
-          <w:sz w:val="24"/>
-          <w:rtl/>
-        </w:rPr>
-        <w:t>• 25 – 30 : قلق مرتفع في هذا السياق</w:t>
-      </w:r>
-    </w:p>
-    <w:p/>
-    <w:p>
-      <w:pPr>
-        <w:bidi/>
-        <w:spacing w:before="200" w:after="120"/>
-        <w:jc w:val="center"/>
-        <w:shd w:val="clear" w:color="auto" w:fill="505050"/>
-      </w:pPr>
-      <w:r>
-        <w:rPr>
-          <w:rFonts w:ascii="Arial" w:hAnsi="Arial"/>
-          <w:b/>
-          <w:color w:val="FFFFFF"/>
-          <w:sz w:val="22"/>
-          <w:rtl/>
-        </w:rPr>
-        <w:t>ملاحظة</w:t>
-      </w:r>
-    </w:p>
-    <w:p>
-      <w:pPr>
-        <w:bidi/>
-        <w:spacing w:before="80" w:after="80"/>
-        <w:jc w:val="right"/>
-      </w:pPr>
-      <w:r>
-        <w:rPr>
-          <w:rFonts w:ascii="Arial" w:hAnsi="Arial"/>
-          <w:b w:val="0"/>
-          <w:color w:val="505050"/>
-          <w:sz w:val="22"/>
-          <w:rtl/>
-        </w:rPr>
-        <w:t>هذا المقياس لأغراض التوعية الذاتية والبحث العلمي. لا يُغني عن الاستشارة المتخصصة. للمزيد من المحتوى التعليمي تابع قناة اسمع على يوتيوب — مملكة الخيزران، الحلقة الثالثة.</w:t>
+        <w:t>McCroskey, J. C. (2005). An introduction to rhetorical communication (9th ed.). Englewood Cliffs, NJ: Prentice Hall.</w:t>
       </w:r>
     </w:p>
     <w:sectPr>
       <w:pgSz w:w="11906" w:h="16838"/>
-      <w:pgMar w:top="1134" w:right="1417" w:bottom="1134" w:left="1417" w:header="720" w:footer="720" w:gutter="0"/>
+      <w:pgMar w:top="1134" w:right="1247" w:bottom="1020" w:left="1247" w:header="720" w:footer="720" w:gutter="0"/>
       <w:cols w:space="720"/>
       <w:docGrid w:linePitch="360"/>
     </w:sectPr>

</xml_diff>

<commit_message>
Update survey questions and add exclusionary note
Update survey questions in Survey.tsx and regenerate Word/PDF documents.

Replit-Commit-Author: Agent
Replit-Commit-Session-Id: b5f3000a-1a7f-48fa-b96c-272316e9f47f
Replit-Commit-Checkpoint-Type: full_checkpoint
Replit-Commit-Event-Id: e2a3e7df-d50c-452f-8dda-6822369f2d60
Replit-Commit-Screenshot-Url: https://storage.googleapis.com/screenshot-production-us-central1/0ddf03ec-4b31-48f4-973d-ddb02c112baa/b5f3000a-1a7f-48fa-b96c-272316e9f47f/0igJ0QT
Replit-Helium-Checkpoint-Created: true
</commit_message>
<xml_diff>
--- a/PRCA-24_Arabic.docx
+++ b/PRCA-24_Arabic.docx
@@ -109,7 +109,7 @@
     <w:p>
       <w:pPr>
         <w:bidi/>
-        <w:spacing w:before="0" w:after="160"/>
+        <w:spacing w:before="0" w:after="100"/>
         <w:jc w:val="center"/>
       </w:pPr>
       <w:r>
@@ -121,6 +121,33 @@
           <w:rtl/>
         </w:rPr>
         <w:t>أوافق بشدة = ١     أوافق = ٢     محايد = ٣     لا أوافق = ٤     لا أوافق بشدة = ٥</w:t>
+      </w:r>
+    </w:p>
+    <w:p>
+      <w:pPr>
+        <w:bidi/>
+        <w:spacing w:before="0" w:after="160"/>
+        <w:jc w:val="right"/>
+        <w:shd w:val="clear" w:color="auto" w:fill="FFF8E1"/>
+      </w:pPr>
+      <w:r>
+        <w:rPr>
+          <w:rFonts w:ascii="Arial" w:hAnsi="Arial"/>
+          <w:b/>
+          <w:color w:val="785000"/>
+          <w:sz w:val="22"/>
+          <w:rtl/>
+        </w:rPr>
+        <w:t xml:space="preserve">ملاحظة: </w:t>
+      </w:r>
+      <w:r>
+        <w:rPr>
+          <w:rFonts w:ascii="Arial" w:hAnsi="Arial"/>
+          <w:color w:val="643C00"/>
+          <w:sz w:val="22"/>
+          <w:rtl/>
+        </w:rPr>
+        <w:t>هذا المقياس لا يتضمن الحديث مع أشخاص تعرفهم أو لك بهم علاقة وطيدة (كالأصدقاء المقربين والأقارب).</w:t>
       </w:r>
     </w:p>
     <w:p>
@@ -2747,7 +2774,7 @@
                 <w:sz w:val="21"/>
                 <w:rtl/>
               </w:rPr>
-              <w:t>18. أخشى التحدث في المحادثات.</w:t>
+              <w:t>18. أخشى التحدث بصوت عالٍ أو المبادرة بالكلام في المحادثات.</w:t>
             </w:r>
           </w:p>
         </w:tc>
@@ -3054,7 +3081,7 @@
                 <w:sz w:val="21"/>
                 <w:rtl/>
               </w:rPr>
-              <w:t>19. لا أخشى إلقاء خطاب.</w:t>
+              <w:t>19. بشكل عام، لا أشعر بالخوف من إلقاء خطاب.</w:t>
             </w:r>
           </w:p>
         </w:tc>
@@ -3657,7 +3684,7 @@
                 <w:sz w:val="21"/>
                 <w:rtl/>
               </w:rPr>
-              <w:t>24. أثناء الخطاب، أصاب بتوتر شديد حتى أنسى حقائق أعرفها جيداً.</w:t>
+              <w:t>24. أثناء الخطاب، أصاب بتوتر شديد حتى أنسى معلومات وحقائق أعرفها جيداً.</w:t>
             </w:r>
           </w:p>
         </w:tc>
@@ -3784,7 +3811,7 @@
           <w:sz w:val="28"/>
           <w:rtl/>
         </w:rPr>
-        <w:t>طريقة الحساب</w:t>
+        <w:t>طريقة حساب الدرجات</w:t>
       </w:r>
     </w:p>
     <w:p>
@@ -3800,7 +3827,7 @@
           <w:sz w:val="22"/>
           <w:rtl/>
         </w:rPr>
-        <w:t>بعد الانتهاء من الإجابة، احسب درجتك لكل محور بالمعادلة التالية:</w:t>
+        <w:t>بعد الإجابة على جميع العبارات، اتبع الخطوات التالية لحساب درجتك:</w:t>
       </w:r>
     </w:p>
     <w:p>
@@ -3818,7 +3845,7 @@
           <w:sz w:val="22"/>
           <w:rtl/>
         </w:rPr>
-        <w:t>المناقشات الجماعية</w:t>
+        <w:t>١. المناقشات الجماعية  (أسئلة ١–٦)</w:t>
       </w:r>
     </w:p>
     <w:p>
@@ -3835,7 +3862,7 @@
           <w:sz w:val="24"/>
           <w:rtl/>
         </w:rPr>
-        <w:t>18 − (س٢ + س٤ + س٦)  +  (س١ + س٣ + س٥)</w:t>
+        <w:t>المعادلة: 18 + (س٢ + س٤ + س٦) − (س١ + س٣ + س٥)</w:t>
       </w:r>
     </w:p>
     <w:p>
@@ -3851,7 +3878,7 @@
           <w:sz w:val="24"/>
           <w:rtl/>
         </w:rPr>
-        <w:t>درجة المناقشات = ___________</w:t>
+        <w:t>درجة المناقشات الجماعية = _________  (المدى: ٦ – ٣٠)</w:t>
       </w:r>
     </w:p>
     <w:p>
@@ -3869,7 +3896,7 @@
           <w:sz w:val="22"/>
           <w:rtl/>
         </w:rPr>
-        <w:t>الاجتماعات</w:t>
+        <w:t>٢. الاجتماعات  (أسئلة ٧–١٢)</w:t>
       </w:r>
     </w:p>
     <w:p>
@@ -3886,7 +3913,7 @@
           <w:sz w:val="24"/>
           <w:rtl/>
         </w:rPr>
-        <w:t>18 − (س٨ + س٩ + س١٢)  +  (س٧ + س١٠ + س١١)</w:t>
+        <w:t>المعادلة: 18 + (س٨ + س٩ + س١٢) − (س٧ + س١٠ + س١١)</w:t>
       </w:r>
     </w:p>
     <w:p>
@@ -3902,7 +3929,7 @@
           <w:sz w:val="24"/>
           <w:rtl/>
         </w:rPr>
-        <w:t>درجة الاجتماعات = ___________</w:t>
+        <w:t>درجة الاجتماعات = _________  (المدى: ٦ – ٣٠)</w:t>
       </w:r>
     </w:p>
     <w:p>
@@ -3920,7 +3947,7 @@
           <w:sz w:val="22"/>
           <w:rtl/>
         </w:rPr>
-        <w:t>المحادثات الشخصية</w:t>
+        <w:t>٣. المحادثات الشخصية  (أسئلة ١٣–١٨)</w:t>
       </w:r>
     </w:p>
     <w:p>
@@ -3937,7 +3964,7 @@
           <w:sz w:val="24"/>
           <w:rtl/>
         </w:rPr>
-        <w:t>18 − (س١٤ + س١٦ + س١٧)  +  (س١٣ + س١٥ + س١٨)</w:t>
+        <w:t>المعادلة: 18 + (س١٤ + س١٦ + س١٧) − (س١٣ + س١٥ + س١٨)</w:t>
       </w:r>
     </w:p>
     <w:p>
@@ -3953,7 +3980,7 @@
           <w:sz w:val="24"/>
           <w:rtl/>
         </w:rPr>
-        <w:t>درجة المحادثات = ___________</w:t>
+        <w:t>درجة المحادثات = _________  (المدى: ٦ – ٣٠)</w:t>
       </w:r>
     </w:p>
     <w:p>
@@ -3971,7 +3998,7 @@
           <w:sz w:val="22"/>
           <w:rtl/>
         </w:rPr>
-        <w:t>الخطابة أمام الجمهور</w:t>
+        <w:t>٤. الخطابة  (أسئلة ١٩–٢٤)</w:t>
       </w:r>
     </w:p>
     <w:p>
@@ -3988,7 +4015,7 @@
           <w:sz w:val="24"/>
           <w:rtl/>
         </w:rPr>
-        <w:t>18 − (س١٩ + س٢١ + س٢٣)  +  (س٢٠ + س٢٢ + س٢٤)</w:t>
+        <w:t>المعادلة: 18 + (س١٩ + س٢١ + س٢٣) − (س٢٠ + س٢٢ + س٢٤)</w:t>
       </w:r>
     </w:p>
     <w:p>
@@ -4004,7 +4031,7 @@
           <w:sz w:val="24"/>
           <w:rtl/>
         </w:rPr>
-        <w:t>درجة الخطابة = ___________</w:t>
+        <w:t>درجة الخطابة = _________  (المدى: ٦ – ٣٠)</w:t>
       </w:r>
     </w:p>
     <w:p>
@@ -4055,7 +4082,7 @@
           <w:sz w:val="26"/>
           <w:rtl/>
         </w:rPr>
-        <w:t>الدرجة الكلية = _______________      (المدى: 24 – 120)</w:t>
+        <w:t>الدرجة الكلية = _________  (المدى: 24 – 120)</w:t>
       </w:r>
     </w:p>
     <w:p>
@@ -4076,57 +4103,6 @@
         <w:t>تفسير الدرجات</w:t>
       </w:r>
     </w:p>
-    <w:p>
-      <w:pPr>
-        <w:bidi/>
-        <w:spacing w:before="80" w:after="160"/>
-        <w:jc w:val="right"/>
-      </w:pPr>
-      <w:r>
-        <w:rPr>
-          <w:rFonts w:ascii="Arial" w:hAnsi="Arial"/>
-          <w:b w:val="0"/>
-          <w:sz w:val="22"/>
-          <w:rtl/>
-        </w:rPr>
-        <w:t>الدرجات دون 51 تمثل أفراداً لديهم قلق تواصل منخفض جداً. الدرجات بين 51 و80 تمثل أفراداً لديهم قلق تواصل متوسط. الدرجات فوق 80 تمثل أفراداً لديهم مستويات مرتفعة من قلق التواصل السمة.</w:t>
-      </w:r>
-    </w:p>
-    <w:p>
-      <w:pPr>
-        <w:bidi/>
-        <w:spacing w:before="80" w:after="60"/>
-        <w:jc w:val="center"/>
-        <w:shd w:val="clear" w:color="auto" w:fill="007064"/>
-      </w:pPr>
-      <w:r>
-        <w:rPr>
-          <w:rFonts w:ascii="Arial" w:hAnsi="Arial"/>
-          <w:b/>
-          <w:color w:val="FFFFFF"/>
-          <w:sz w:val="26"/>
-          <w:rtl/>
-        </w:rPr>
-        <w:t>المعايير المرجعية للمقياس PRCA-24</w:t>
-      </w:r>
-    </w:p>
-    <w:p>
-      <w:pPr>
-        <w:bidi/>
-        <w:spacing w:before="60" w:after="100"/>
-        <w:jc w:val="right"/>
-      </w:pPr>
-      <w:r>
-        <w:rPr>
-          <w:rFonts w:ascii="Arial" w:hAnsi="Arial"/>
-          <w:b w:val="0"/>
-          <w:color w:val="646464"/>
-          <w:sz w:val="18"/>
-          <w:rtl/>
-        </w:rPr>
-        <w:t>(مبنية على بيانات أكثر من 40,000 طالب جامعي، وبيانات أكثر من 3,000 بالغ من غير الطلاب في عينة وطنية — النتائج متطابقة تقريباً في كلا المجموعتين بفارق لا يتجاوز 0.20 لجميع الدرجات.)</w:t>
-      </w:r>
-    </w:p>
     <w:tbl>
       <w:tblPr>
         <w:tblStyle w:val="TableGrid"/>
@@ -4135,16 +4111,14 @@
         <w:tblLook w:firstColumn="1" w:firstRow="1" w:lastColumn="0" w:lastRow="0" w:noHBand="0" w:noVBand="1" w:val="04A0"/>
       </w:tblPr>
       <w:tblGrid>
-        <w:gridCol w:w="1882"/>
-        <w:gridCol w:w="1882"/>
-        <w:gridCol w:w="1882"/>
-        <w:gridCol w:w="1882"/>
-        <w:gridCol w:w="1882"/>
+        <w:gridCol w:w="3137"/>
+        <w:gridCol w:w="3137"/>
+        <w:gridCol w:w="3137"/>
       </w:tblGrid>
       <w:tr>
         <w:tc>
           <w:tcPr>
-            <w:tcW w:type="dxa" w:w="2948"/>
+            <w:tcW w:type="dxa" w:w="2551"/>
             <w:shd w:val="clear" w:color="auto" w:fill="007064"/>
           </w:tcPr>
           <w:p>
@@ -4160,13 +4134,13 @@
                 <w:sz w:val="20"/>
                 <w:rtl/>
               </w:rPr>
-              <w:t>المحور / الدرجة</w:t>
+              <w:t>الدرجة الكلية</w:t>
             </w:r>
           </w:p>
         </w:tc>
         <w:tc>
           <w:tcPr>
-            <w:tcW w:type="dxa" w:w="1814"/>
+            <w:tcW w:type="dxa" w:w="2551"/>
             <w:shd w:val="clear" w:color="auto" w:fill="007064"/>
           </w:tcPr>
           <w:p>
@@ -4182,13 +4156,13 @@
                 <w:sz w:val="20"/>
                 <w:rtl/>
               </w:rPr>
-              <w:t>المتوسط</w:t>
+              <w:t>مستوى القلق</w:t>
             </w:r>
           </w:p>
         </w:tc>
         <w:tc>
           <w:tcPr>
-            <w:tcW w:type="dxa" w:w="2154"/>
+            <w:tcW w:type="dxa" w:w="5102"/>
             <w:shd w:val="clear" w:color="auto" w:fill="007064"/>
           </w:tcPr>
           <w:p>
@@ -4204,51 +4178,7 @@
                 <w:sz w:val="20"/>
                 <w:rtl/>
               </w:rPr>
-              <w:t>الانحراف المعياري</w:t>
-            </w:r>
-          </w:p>
-        </w:tc>
-        <w:tc>
-          <w:tcPr>
-            <w:tcW w:type="dxa" w:w="1587"/>
-            <w:shd w:val="clear" w:color="auto" w:fill="007064"/>
-          </w:tcPr>
-          <w:p>
-            <w:pPr>
-              <w:spacing w:before="40" w:after="40"/>
-              <w:jc w:val="center"/>
-            </w:pPr>
-            <w:r>
-              <w:rPr>
-                <w:rFonts w:ascii="Arial" w:hAnsi="Arial"/>
-                <w:b/>
-                <w:color w:val="FFFFFF"/>
-                <w:sz w:val="20"/>
-                <w:rtl/>
-              </w:rPr>
-              <w:t>مرتفع</w:t>
-            </w:r>
-          </w:p>
-        </w:tc>
-        <w:tc>
-          <w:tcPr>
-            <w:tcW w:type="dxa" w:w="1701"/>
-            <w:shd w:val="clear" w:color="auto" w:fill="007064"/>
-          </w:tcPr>
-          <w:p>
-            <w:pPr>
-              <w:spacing w:before="40" w:after="40"/>
-              <w:jc w:val="center"/>
-            </w:pPr>
-            <w:r>
-              <w:rPr>
-                <w:rFonts w:ascii="Arial" w:hAnsi="Arial"/>
-                <w:b/>
-                <w:color w:val="FFFFFF"/>
-                <w:sz w:val="20"/>
-                <w:rtl/>
-              </w:rPr>
-              <w:t>منخفض</w:t>
+              <w:t>التفسير</w:t>
             </w:r>
           </w:p>
         </w:tc>
@@ -4256,121 +4186,73 @@
       <w:tr>
         <w:tc>
           <w:tcPr>
-            <w:tcW w:type="dxa" w:w="2948"/>
-            <w:shd w:val="clear" w:color="auto" w:fill="FFFFFF"/>
+            <w:tcW w:type="dxa" w:w="2551"/>
+            <w:shd w:val="clear" w:color="auto" w:fill="D1F5EE"/>
             <w:vAlign w:val="center"/>
           </w:tcPr>
           <w:p>
             <w:pPr>
               <w:bidi/>
-              <w:spacing w:before="40" w:after="40"/>
+              <w:spacing w:before="80" w:after="80"/>
+              <w:jc w:val="center"/>
+            </w:pPr>
+            <w:r>
+              <w:rPr>
+                <w:rFonts w:ascii="Arial" w:hAnsi="Arial"/>
+                <w:b/>
+                <w:color w:val="007064"/>
+                <w:sz w:val="21"/>
+                <w:rtl/>
+              </w:rPr>
+              <w:t>أقل من 51</w:t>
+            </w:r>
+          </w:p>
+        </w:tc>
+        <w:tc>
+          <w:tcPr>
+            <w:tcW w:type="dxa" w:w="2551"/>
+            <w:shd w:val="clear" w:color="auto" w:fill="D1F5EE"/>
+            <w:vAlign w:val="center"/>
+          </w:tcPr>
+          <w:p>
+            <w:pPr>
+              <w:bidi/>
+              <w:spacing w:before="80" w:after="80"/>
+              <w:jc w:val="center"/>
+            </w:pPr>
+            <w:r>
+              <w:rPr>
+                <w:rFonts w:ascii="Arial" w:hAnsi="Arial"/>
+                <w:b/>
+                <w:color w:val="007064"/>
+                <w:sz w:val="21"/>
+                <w:rtl/>
+              </w:rPr>
+              <w:t>قلق منخفض</w:t>
+            </w:r>
+          </w:p>
+        </w:tc>
+        <w:tc>
+          <w:tcPr>
+            <w:tcW w:type="dxa" w:w="5102"/>
+            <w:shd w:val="clear" w:color="auto" w:fill="D1F5EE"/>
+            <w:vAlign w:val="center"/>
+          </w:tcPr>
+          <w:p>
+            <w:pPr>
+              <w:bidi/>
+              <w:spacing w:before="80" w:after="80"/>
               <w:jc w:val="right"/>
             </w:pPr>
             <w:r>
               <w:rPr>
                 <w:rFonts w:ascii="Arial" w:hAnsi="Arial"/>
-                <w:b/>
-                <w:color w:val="005048"/>
-                <w:sz w:val="20"/>
+                <w:b w:val="0"/>
+                <w:color w:val="007064"/>
+                <w:sz w:val="21"/>
                 <w:rtl/>
               </w:rPr>
-              <w:t>الدرجة الكلية</w:t>
-            </w:r>
-          </w:p>
-        </w:tc>
-        <w:tc>
-          <w:tcPr>
-            <w:tcW w:type="dxa" w:w="1814"/>
-            <w:shd w:val="clear" w:color="auto" w:fill="FFFFFF"/>
-            <w:vAlign w:val="center"/>
-          </w:tcPr>
-          <w:p>
-            <w:pPr>
-              <w:bidi/>
-              <w:spacing w:before="40" w:after="40"/>
-              <w:jc w:val="center"/>
-            </w:pPr>
-            <w:r>
-              <w:rPr>
-                <w:rFonts w:ascii="Arial" w:hAnsi="Arial"/>
-                <w:b w:val="0"/>
-                <w:color w:val="1E1E1E"/>
-                <w:sz w:val="20"/>
-                <w:rtl/>
-              </w:rPr>
-              <w:t>65.6</w:t>
-            </w:r>
-          </w:p>
-        </w:tc>
-        <w:tc>
-          <w:tcPr>
-            <w:tcW w:type="dxa" w:w="2154"/>
-            <w:shd w:val="clear" w:color="auto" w:fill="FFFFFF"/>
-            <w:vAlign w:val="center"/>
-          </w:tcPr>
-          <w:p>
-            <w:pPr>
-              <w:bidi/>
-              <w:spacing w:before="40" w:after="40"/>
-              <w:jc w:val="center"/>
-            </w:pPr>
-            <w:r>
-              <w:rPr>
-                <w:rFonts w:ascii="Arial" w:hAnsi="Arial"/>
-                <w:b w:val="0"/>
-                <w:color w:val="1E1E1E"/>
-                <w:sz w:val="20"/>
-                <w:rtl/>
-              </w:rPr>
-              <w:t>15.3</w:t>
-            </w:r>
-          </w:p>
-        </w:tc>
-        <w:tc>
-          <w:tcPr>
-            <w:tcW w:type="dxa" w:w="1587"/>
-            <w:shd w:val="clear" w:color="auto" w:fill="FFFFFF"/>
-            <w:vAlign w:val="center"/>
-          </w:tcPr>
-          <w:p>
-            <w:pPr>
-              <w:bidi/>
-              <w:spacing w:before="40" w:after="40"/>
-              <w:jc w:val="center"/>
-            </w:pPr>
-            <w:r>
-              <w:rPr>
-                <w:rFonts w:ascii="Arial" w:hAnsi="Arial"/>
-                <w:b w:val="0"/>
-                <w:color w:val="1E1E1E"/>
-                <w:sz w:val="20"/>
-                <w:rtl/>
-              </w:rPr>
-              <w:t>&gt; 80</w:t>
-            </w:r>
-          </w:p>
-        </w:tc>
-        <w:tc>
-          <w:tcPr>
-            <w:tcW w:type="dxa" w:w="1701"/>
-            <w:shd w:val="clear" w:color="auto" w:fill="FFFFFF"/>
-            <w:vAlign w:val="center"/>
-          </w:tcPr>
-          <w:p>
-            <w:pPr>
-              <w:bidi/>
-              <w:spacing w:before="40" w:after="40"/>
-              <w:jc w:val="center"/>
-            </w:pPr>
-            <w:r>
-              <w:rPr>
-                <w:rFonts w:ascii="Arial" w:hAnsi="Arial"/>
-                <w:b w:val="0"/>
-                <w:color w:val="1E1E1E"/>
-                <w:sz w:val="20"/>
-                <w:rtl/>
-              </w:rPr>
-              <w:t>&lt; 51</w:t>
+              <w:t>تتمتع بثقة عالية في التواصل مع الآخرين. التواصل يُشكّل قوة لديك.</w:t>
             </w:r>
           </w:p>
         </w:tc>
@@ -4378,121 +4260,73 @@
       <w:tr>
         <w:tc>
           <w:tcPr>
-            <w:tcW w:type="dxa" w:w="2948"/>
-            <w:shd w:val="clear" w:color="auto" w:fill="E8F5F3"/>
+            <w:tcW w:type="dxa" w:w="2551"/>
+            <w:shd w:val="clear" w:color="auto" w:fill="FFF8E1"/>
             <w:vAlign w:val="center"/>
           </w:tcPr>
           <w:p>
             <w:pPr>
               <w:bidi/>
-              <w:spacing w:before="40" w:after="40"/>
+              <w:spacing w:before="80" w:after="80"/>
+              <w:jc w:val="center"/>
+            </w:pPr>
+            <w:r>
+              <w:rPr>
+                <w:rFonts w:ascii="Arial" w:hAnsi="Arial"/>
+                <w:b/>
+                <w:color w:val="8B6914"/>
+                <w:sz w:val="21"/>
+                <w:rtl/>
+              </w:rPr>
+              <w:t>51 – 80</w:t>
+            </w:r>
+          </w:p>
+        </w:tc>
+        <w:tc>
+          <w:tcPr>
+            <w:tcW w:type="dxa" w:w="2551"/>
+            <w:shd w:val="clear" w:color="auto" w:fill="FFF8E1"/>
+            <w:vAlign w:val="center"/>
+          </w:tcPr>
+          <w:p>
+            <w:pPr>
+              <w:bidi/>
+              <w:spacing w:before="80" w:after="80"/>
+              <w:jc w:val="center"/>
+            </w:pPr>
+            <w:r>
+              <w:rPr>
+                <w:rFonts w:ascii="Arial" w:hAnsi="Arial"/>
+                <w:b/>
+                <w:color w:val="8B6914"/>
+                <w:sz w:val="21"/>
+                <w:rtl/>
+              </w:rPr>
+              <w:t>قلق متوسط</w:t>
+            </w:r>
+          </w:p>
+        </w:tc>
+        <w:tc>
+          <w:tcPr>
+            <w:tcW w:type="dxa" w:w="5102"/>
+            <w:shd w:val="clear" w:color="auto" w:fill="FFF8E1"/>
+            <w:vAlign w:val="center"/>
+          </w:tcPr>
+          <w:p>
+            <w:pPr>
+              <w:bidi/>
+              <w:spacing w:before="80" w:after="80"/>
               <w:jc w:val="right"/>
             </w:pPr>
             <w:r>
               <w:rPr>
                 <w:rFonts w:ascii="Arial" w:hAnsi="Arial"/>
-                <w:b/>
-                <w:color w:val="005048"/>
-                <w:sz w:val="20"/>
+                <w:b w:val="0"/>
+                <w:color w:val="8B6914"/>
+                <w:sz w:val="21"/>
                 <w:rtl/>
               </w:rPr>
-              <w:t>المناقشات الجماعية</w:t>
-            </w:r>
-          </w:p>
-        </w:tc>
-        <w:tc>
-          <w:tcPr>
-            <w:tcW w:type="dxa" w:w="1814"/>
-            <w:shd w:val="clear" w:color="auto" w:fill="E8F5F3"/>
-            <w:vAlign w:val="center"/>
-          </w:tcPr>
-          <w:p>
-            <w:pPr>
-              <w:bidi/>
-              <w:spacing w:before="40" w:after="40"/>
-              <w:jc w:val="center"/>
-            </w:pPr>
-            <w:r>
-              <w:rPr>
-                <w:rFonts w:ascii="Arial" w:hAnsi="Arial"/>
-                <w:b w:val="0"/>
-                <w:color w:val="1E1E1E"/>
-                <w:sz w:val="20"/>
-                <w:rtl/>
-              </w:rPr>
-              <w:t>15.4</w:t>
-            </w:r>
-          </w:p>
-        </w:tc>
-        <w:tc>
-          <w:tcPr>
-            <w:tcW w:type="dxa" w:w="2154"/>
-            <w:shd w:val="clear" w:color="auto" w:fill="E8F5F3"/>
-            <w:vAlign w:val="center"/>
-          </w:tcPr>
-          <w:p>
-            <w:pPr>
-              <w:bidi/>
-              <w:spacing w:before="40" w:after="40"/>
-              <w:jc w:val="center"/>
-            </w:pPr>
-            <w:r>
-              <w:rPr>
-                <w:rFonts w:ascii="Arial" w:hAnsi="Arial"/>
-                <w:b w:val="0"/>
-                <w:color w:val="1E1E1E"/>
-                <w:sz w:val="20"/>
-                <w:rtl/>
-              </w:rPr>
-              <w:t>4.8</w:t>
-            </w:r>
-          </w:p>
-        </w:tc>
-        <w:tc>
-          <w:tcPr>
-            <w:tcW w:type="dxa" w:w="1587"/>
-            <w:shd w:val="clear" w:color="auto" w:fill="E8F5F3"/>
-            <w:vAlign w:val="center"/>
-          </w:tcPr>
-          <w:p>
-            <w:pPr>
-              <w:bidi/>
-              <w:spacing w:before="40" w:after="40"/>
-              <w:jc w:val="center"/>
-            </w:pPr>
-            <w:r>
-              <w:rPr>
-                <w:rFonts w:ascii="Arial" w:hAnsi="Arial"/>
-                <w:b w:val="0"/>
-                <w:color w:val="1E1E1E"/>
-                <w:sz w:val="20"/>
-                <w:rtl/>
-              </w:rPr>
-              <w:t>&gt; 20</w:t>
-            </w:r>
-          </w:p>
-        </w:tc>
-        <w:tc>
-          <w:tcPr>
-            <w:tcW w:type="dxa" w:w="1701"/>
-            <w:shd w:val="clear" w:color="auto" w:fill="E8F5F3"/>
-            <w:vAlign w:val="center"/>
-          </w:tcPr>
-          <w:p>
-            <w:pPr>
-              <w:bidi/>
-              <w:spacing w:before="40" w:after="40"/>
-              <w:jc w:val="center"/>
-            </w:pPr>
-            <w:r>
-              <w:rPr>
-                <w:rFonts w:ascii="Arial" w:hAnsi="Arial"/>
-                <w:b w:val="0"/>
-                <w:color w:val="1E1E1E"/>
-                <w:sz w:val="20"/>
-                <w:rtl/>
-              </w:rPr>
-              <w:t>&lt; 11</w:t>
+              <w:t>تقع ضمن النطاق الطبيعي. قد تشعر ببعض القلق في مواقف معينة.</w:t>
             </w:r>
           </w:p>
         </w:tc>
@@ -4500,371 +4334,161 @@
       <w:tr>
         <w:tc>
           <w:tcPr>
-            <w:tcW w:type="dxa" w:w="2948"/>
-            <w:shd w:val="clear" w:color="auto" w:fill="FFFFFF"/>
+            <w:tcW w:type="dxa" w:w="2551"/>
+            <w:shd w:val="clear" w:color="auto" w:fill="FFE8E8"/>
             <w:vAlign w:val="center"/>
           </w:tcPr>
           <w:p>
             <w:pPr>
               <w:bidi/>
-              <w:spacing w:before="40" w:after="40"/>
+              <w:spacing w:before="80" w:after="80"/>
+              <w:jc w:val="center"/>
+            </w:pPr>
+            <w:r>
+              <w:rPr>
+                <w:rFonts w:ascii="Arial" w:hAnsi="Arial"/>
+                <w:b/>
+                <w:color w:val="A02018"/>
+                <w:sz w:val="21"/>
+                <w:rtl/>
+              </w:rPr>
+              <w:t>أكثر من 80</w:t>
+            </w:r>
+          </w:p>
+        </w:tc>
+        <w:tc>
+          <w:tcPr>
+            <w:tcW w:type="dxa" w:w="2551"/>
+            <w:shd w:val="clear" w:color="auto" w:fill="FFE8E8"/>
+            <w:vAlign w:val="center"/>
+          </w:tcPr>
+          <w:p>
+            <w:pPr>
+              <w:bidi/>
+              <w:spacing w:before="80" w:after="80"/>
+              <w:jc w:val="center"/>
+            </w:pPr>
+            <w:r>
+              <w:rPr>
+                <w:rFonts w:ascii="Arial" w:hAnsi="Arial"/>
+                <w:b/>
+                <w:color w:val="A02018"/>
+                <w:sz w:val="21"/>
+                <w:rtl/>
+              </w:rPr>
+              <w:t>قلق مرتفع</w:t>
+            </w:r>
+          </w:p>
+        </w:tc>
+        <w:tc>
+          <w:tcPr>
+            <w:tcW w:type="dxa" w:w="5102"/>
+            <w:shd w:val="clear" w:color="auto" w:fill="FFE8E8"/>
+            <w:vAlign w:val="center"/>
+          </w:tcPr>
+          <w:p>
+            <w:pPr>
+              <w:bidi/>
+              <w:spacing w:before="80" w:after="80"/>
               <w:jc w:val="right"/>
             </w:pPr>
             <w:r>
               <w:rPr>
                 <w:rFonts w:ascii="Arial" w:hAnsi="Arial"/>
-                <w:b/>
-                <w:color w:val="005048"/>
-                <w:sz w:val="20"/>
+                <w:b w:val="0"/>
+                <w:color w:val="A02018"/>
+                <w:sz w:val="21"/>
                 <w:rtl/>
               </w:rPr>
-              <w:t>الاجتماعات</w:t>
-            </w:r>
-          </w:p>
-        </w:tc>
-        <w:tc>
-          <w:tcPr>
-            <w:tcW w:type="dxa" w:w="1814"/>
-            <w:shd w:val="clear" w:color="auto" w:fill="FFFFFF"/>
-            <w:vAlign w:val="center"/>
-          </w:tcPr>
-          <w:p>
-            <w:pPr>
-              <w:bidi/>
-              <w:spacing w:before="40" w:after="40"/>
-              <w:jc w:val="center"/>
-            </w:pPr>
-            <w:r>
-              <w:rPr>
-                <w:rFonts w:ascii="Arial" w:hAnsi="Arial"/>
-                <w:b w:val="0"/>
-                <w:color w:val="1E1E1E"/>
-                <w:sz w:val="20"/>
-                <w:rtl/>
-              </w:rPr>
-              <w:t>16.4</w:t>
-            </w:r>
-          </w:p>
-        </w:tc>
-        <w:tc>
-          <w:tcPr>
-            <w:tcW w:type="dxa" w:w="2154"/>
-            <w:shd w:val="clear" w:color="auto" w:fill="FFFFFF"/>
-            <w:vAlign w:val="center"/>
-          </w:tcPr>
-          <w:p>
-            <w:pPr>
-              <w:bidi/>
-              <w:spacing w:before="40" w:after="40"/>
-              <w:jc w:val="center"/>
-            </w:pPr>
-            <w:r>
-              <w:rPr>
-                <w:rFonts w:ascii="Arial" w:hAnsi="Arial"/>
-                <w:b w:val="0"/>
-                <w:color w:val="1E1E1E"/>
-                <w:sz w:val="20"/>
-                <w:rtl/>
-              </w:rPr>
-              <w:t>4.2</w:t>
-            </w:r>
-          </w:p>
-        </w:tc>
-        <w:tc>
-          <w:tcPr>
-            <w:tcW w:type="dxa" w:w="1587"/>
-            <w:shd w:val="clear" w:color="auto" w:fill="FFFFFF"/>
-            <w:vAlign w:val="center"/>
-          </w:tcPr>
-          <w:p>
-            <w:pPr>
-              <w:bidi/>
-              <w:spacing w:before="40" w:after="40"/>
-              <w:jc w:val="center"/>
-            </w:pPr>
-            <w:r>
-              <w:rPr>
-                <w:rFonts w:ascii="Arial" w:hAnsi="Arial"/>
-                <w:b w:val="0"/>
-                <w:color w:val="1E1E1E"/>
-                <w:sz w:val="20"/>
-                <w:rtl/>
-              </w:rPr>
-              <w:t>&gt; 20</w:t>
-            </w:r>
-          </w:p>
-        </w:tc>
-        <w:tc>
-          <w:tcPr>
-            <w:tcW w:type="dxa" w:w="1701"/>
-            <w:shd w:val="clear" w:color="auto" w:fill="FFFFFF"/>
-            <w:vAlign w:val="center"/>
-          </w:tcPr>
-          <w:p>
-            <w:pPr>
-              <w:bidi/>
-              <w:spacing w:before="40" w:after="40"/>
-              <w:jc w:val="center"/>
-            </w:pPr>
-            <w:r>
-              <w:rPr>
-                <w:rFonts w:ascii="Arial" w:hAnsi="Arial"/>
-                <w:b w:val="0"/>
-                <w:color w:val="1E1E1E"/>
-                <w:sz w:val="20"/>
-                <w:rtl/>
-              </w:rPr>
-              <w:t>&lt; 13</w:t>
-            </w:r>
-          </w:p>
-        </w:tc>
-      </w:tr>
-      <w:tr>
-        <w:tc>
-          <w:tcPr>
-            <w:tcW w:type="dxa" w:w="2948"/>
-            <w:shd w:val="clear" w:color="auto" w:fill="E8F5F3"/>
-            <w:vAlign w:val="center"/>
-          </w:tcPr>
-          <w:p>
-            <w:pPr>
-              <w:bidi/>
-              <w:spacing w:before="40" w:after="40"/>
-              <w:jc w:val="right"/>
-            </w:pPr>
-            <w:r>
-              <w:rPr>
-                <w:rFonts w:ascii="Arial" w:hAnsi="Arial"/>
-                <w:b/>
-                <w:color w:val="005048"/>
-                <w:sz w:val="20"/>
-                <w:rtl/>
-              </w:rPr>
-              <w:t>المحادثات (الثنائية)</w:t>
-            </w:r>
-          </w:p>
-        </w:tc>
-        <w:tc>
-          <w:tcPr>
-            <w:tcW w:type="dxa" w:w="1814"/>
-            <w:shd w:val="clear" w:color="auto" w:fill="E8F5F3"/>
-            <w:vAlign w:val="center"/>
-          </w:tcPr>
-          <w:p>
-            <w:pPr>
-              <w:bidi/>
-              <w:spacing w:before="40" w:after="40"/>
-              <w:jc w:val="center"/>
-            </w:pPr>
-            <w:r>
-              <w:rPr>
-                <w:rFonts w:ascii="Arial" w:hAnsi="Arial"/>
-                <w:b w:val="0"/>
-                <w:color w:val="1E1E1E"/>
-                <w:sz w:val="20"/>
-                <w:rtl/>
-              </w:rPr>
-              <w:t>14.2</w:t>
-            </w:r>
-          </w:p>
-        </w:tc>
-        <w:tc>
-          <w:tcPr>
-            <w:tcW w:type="dxa" w:w="2154"/>
-            <w:shd w:val="clear" w:color="auto" w:fill="E8F5F3"/>
-            <w:vAlign w:val="center"/>
-          </w:tcPr>
-          <w:p>
-            <w:pPr>
-              <w:bidi/>
-              <w:spacing w:before="40" w:after="40"/>
-              <w:jc w:val="center"/>
-            </w:pPr>
-            <w:r>
-              <w:rPr>
-                <w:rFonts w:ascii="Arial" w:hAnsi="Arial"/>
-                <w:b w:val="0"/>
-                <w:color w:val="1E1E1E"/>
-                <w:sz w:val="20"/>
-                <w:rtl/>
-              </w:rPr>
-              <w:t>3.9</w:t>
-            </w:r>
-          </w:p>
-        </w:tc>
-        <w:tc>
-          <w:tcPr>
-            <w:tcW w:type="dxa" w:w="1587"/>
-            <w:shd w:val="clear" w:color="auto" w:fill="E8F5F3"/>
-            <w:vAlign w:val="center"/>
-          </w:tcPr>
-          <w:p>
-            <w:pPr>
-              <w:bidi/>
-              <w:spacing w:before="40" w:after="40"/>
-              <w:jc w:val="center"/>
-            </w:pPr>
-            <w:r>
-              <w:rPr>
-                <w:rFonts w:ascii="Arial" w:hAnsi="Arial"/>
-                <w:b w:val="0"/>
-                <w:color w:val="1E1E1E"/>
-                <w:sz w:val="20"/>
-                <w:rtl/>
-              </w:rPr>
-              <w:t>&gt; 18</w:t>
-            </w:r>
-          </w:p>
-        </w:tc>
-        <w:tc>
-          <w:tcPr>
-            <w:tcW w:type="dxa" w:w="1701"/>
-            <w:shd w:val="clear" w:color="auto" w:fill="E8F5F3"/>
-            <w:vAlign w:val="center"/>
-          </w:tcPr>
-          <w:p>
-            <w:pPr>
-              <w:bidi/>
-              <w:spacing w:before="40" w:after="40"/>
-              <w:jc w:val="center"/>
-            </w:pPr>
-            <w:r>
-              <w:rPr>
-                <w:rFonts w:ascii="Arial" w:hAnsi="Arial"/>
-                <w:b w:val="0"/>
-                <w:color w:val="1E1E1E"/>
-                <w:sz w:val="20"/>
-                <w:rtl/>
-              </w:rPr>
-              <w:t>&lt; 11</w:t>
-            </w:r>
-          </w:p>
-        </w:tc>
-      </w:tr>
-      <w:tr>
-        <w:tc>
-          <w:tcPr>
-            <w:tcW w:type="dxa" w:w="2948"/>
-            <w:shd w:val="clear" w:color="auto" w:fill="FFFFFF"/>
-            <w:vAlign w:val="center"/>
-          </w:tcPr>
-          <w:p>
-            <w:pPr>
-              <w:bidi/>
-              <w:spacing w:before="40" w:after="40"/>
-              <w:jc w:val="right"/>
-            </w:pPr>
-            <w:r>
-              <w:rPr>
-                <w:rFonts w:ascii="Arial" w:hAnsi="Arial"/>
-                <w:b/>
-                <w:color w:val="005048"/>
-                <w:sz w:val="20"/>
-                <w:rtl/>
-              </w:rPr>
-              <w:t>الخطابة أمام الجمهور</w:t>
-            </w:r>
-          </w:p>
-        </w:tc>
-        <w:tc>
-          <w:tcPr>
-            <w:tcW w:type="dxa" w:w="1814"/>
-            <w:shd w:val="clear" w:color="auto" w:fill="FFFFFF"/>
-            <w:vAlign w:val="center"/>
-          </w:tcPr>
-          <w:p>
-            <w:pPr>
-              <w:bidi/>
-              <w:spacing w:before="40" w:after="40"/>
-              <w:jc w:val="center"/>
-            </w:pPr>
-            <w:r>
-              <w:rPr>
-                <w:rFonts w:ascii="Arial" w:hAnsi="Arial"/>
-                <w:b w:val="0"/>
-                <w:color w:val="1E1E1E"/>
-                <w:sz w:val="20"/>
-                <w:rtl/>
-              </w:rPr>
-              <w:t>19.3</w:t>
-            </w:r>
-          </w:p>
-        </w:tc>
-        <w:tc>
-          <w:tcPr>
-            <w:tcW w:type="dxa" w:w="2154"/>
-            <w:shd w:val="clear" w:color="auto" w:fill="FFFFFF"/>
-            <w:vAlign w:val="center"/>
-          </w:tcPr>
-          <w:p>
-            <w:pPr>
-              <w:bidi/>
-              <w:spacing w:before="40" w:after="40"/>
-              <w:jc w:val="center"/>
-            </w:pPr>
-            <w:r>
-              <w:rPr>
-                <w:rFonts w:ascii="Arial" w:hAnsi="Arial"/>
-                <w:b w:val="0"/>
-                <w:color w:val="1E1E1E"/>
-                <w:sz w:val="20"/>
-                <w:rtl/>
-              </w:rPr>
-              <w:t>5.1</w:t>
-            </w:r>
-          </w:p>
-        </w:tc>
-        <w:tc>
-          <w:tcPr>
-            <w:tcW w:type="dxa" w:w="1587"/>
-            <w:shd w:val="clear" w:color="auto" w:fill="FFFFFF"/>
-            <w:vAlign w:val="center"/>
-          </w:tcPr>
-          <w:p>
-            <w:pPr>
-              <w:bidi/>
-              <w:spacing w:before="40" w:after="40"/>
-              <w:jc w:val="center"/>
-            </w:pPr>
-            <w:r>
-              <w:rPr>
-                <w:rFonts w:ascii="Arial" w:hAnsi="Arial"/>
-                <w:b w:val="0"/>
-                <w:color w:val="1E1E1E"/>
-                <w:sz w:val="20"/>
-                <w:rtl/>
-              </w:rPr>
-              <w:t>&gt; 24</w:t>
-            </w:r>
-          </w:p>
-        </w:tc>
-        <w:tc>
-          <w:tcPr>
-            <w:tcW w:type="dxa" w:w="1701"/>
-            <w:shd w:val="clear" w:color="auto" w:fill="FFFFFF"/>
-            <w:vAlign w:val="center"/>
-          </w:tcPr>
-          <w:p>
-            <w:pPr>
-              <w:bidi/>
-              <w:spacing w:before="40" w:after="40"/>
-              <w:jc w:val="center"/>
-            </w:pPr>
-            <w:r>
-              <w:rPr>
-                <w:rFonts w:ascii="Arial" w:hAnsi="Arial"/>
-                <w:b w:val="0"/>
-                <w:color w:val="1E1E1E"/>
-                <w:sz w:val="20"/>
-                <w:rtl/>
-              </w:rPr>
-              <w:t>&lt; 14</w:t>
+              <w:t>تجد صعوبة ملحوظة في التواصل. ينصح بالتدريب على مهارات التواصل.</w:t>
             </w:r>
           </w:p>
         </w:tc>
       </w:tr>
     </w:tbl>
     <w:p/>
+    <w:p>
+      <w:pPr>
+        <w:bidi/>
+        <w:spacing w:before="120" w:after="60"/>
+        <w:jc w:val="center"/>
+        <w:shd w:val="clear" w:color="auto" w:fill="007064"/>
+      </w:pPr>
+      <w:r>
+        <w:rPr>
+          <w:rFonts w:ascii="Arial" w:hAnsi="Arial"/>
+          <w:b/>
+          <w:color w:val="FFFFFF"/>
+          <w:sz w:val="24"/>
+          <w:rtl/>
+        </w:rPr>
+        <w:t>مدى درجات المحاور الفرعية</w:t>
+      </w:r>
+    </w:p>
+    <w:p>
+      <w:pPr>
+        <w:bidi/>
+        <w:spacing w:before="60" w:after="60"/>
+        <w:jc w:val="right"/>
+      </w:pPr>
+      <w:r>
+        <w:rPr>
+          <w:rFonts w:ascii="Arial" w:hAnsi="Arial"/>
+          <w:b w:val="0"/>
+          <w:sz w:val="22"/>
+          <w:rtl/>
+        </w:rPr>
+        <w:t>كل محور تتراوح درجاته بين 6 و30:</w:t>
+      </w:r>
+    </w:p>
+    <w:p>
+      <w:pPr>
+        <w:bidi/>
+        <w:spacing w:before="20" w:after="20"/>
+        <w:jc w:val="right"/>
+      </w:pPr>
+      <w:r>
+        <w:rPr>
+          <w:rFonts w:ascii="Arial" w:hAnsi="Arial"/>
+          <w:b w:val="0"/>
+          <w:sz w:val="22"/>
+          <w:rtl/>
+        </w:rPr>
+        <w:t>• 6 – 17 : قلق منخفض في هذا السياق</w:t>
+      </w:r>
+    </w:p>
+    <w:p>
+      <w:pPr>
+        <w:bidi/>
+        <w:spacing w:before="20" w:after="20"/>
+        <w:jc w:val="right"/>
+      </w:pPr>
+      <w:r>
+        <w:rPr>
+          <w:rFonts w:ascii="Arial" w:hAnsi="Arial"/>
+          <w:b w:val="0"/>
+          <w:sz w:val="22"/>
+          <w:rtl/>
+        </w:rPr>
+        <w:t>• 18 – 24 : قلق متوسط في هذا السياق</w:t>
+      </w:r>
+    </w:p>
+    <w:p>
+      <w:pPr>
+        <w:bidi/>
+        <w:spacing w:before="20" w:after="20"/>
+        <w:jc w:val="right"/>
+      </w:pPr>
+      <w:r>
+        <w:rPr>
+          <w:rFonts w:ascii="Arial" w:hAnsi="Arial"/>
+          <w:b w:val="0"/>
+          <w:sz w:val="22"/>
+          <w:rtl/>
+        </w:rPr>
+        <w:t>• 25 – 30 : قلق مرتفع في هذا السياق</w:t>
+      </w:r>
+    </w:p>
     <w:p/>
     <w:p>
       <w:pPr>

</xml_diff>